<commit_message>
Finalize manuscript_v2: resolve figure/table compression (6 figs/5 tables main text, 2 tables + 1 fig moved to Supplementary Material), rebuild submission DOCX/PDF, assemble complete submission package (cover letter, highlights, declarations, checklist with P1-P12 open items, supplementary material)
Co-Authored-By: Claude Sonnet 5 <noreply@anthropic.com>
Claude-Session: https://claude.ai/code/session_01CcqZYMkMVHhsffAfbdzjDH
</commit_message>
<xml_diff>
--- a/submission/manuscript.docx
+++ b/submission/manuscript.docx
@@ -1183,7 +1183,21 @@
           <w:rFonts w:ascii="Times New Roman" w:hAnsi="Times New Roman" w:eastAsia="Times New Roman"/>
           <w:sz w:val="24"/>
         </w:rPr>
-        <w:t>) assembles a full descriptive and balance summary by arm — means, standard deviations, and missing rates — for all outcome and control variables reported as regression outcomes in Table 3.</w:t>
+        <w:t xml:space="preserve">) assembles a full descriptive and balance summary by arm — means, standard deviations, and missing rates — for all outcome and control variables reported as regression outcomes in Table 3. The main text retains six figures (Fig. 1–6) and five tables (Table 1–5); the Winall financial panel, the enterprise-versus-public-institution descriptive comparison, and the missingness-balance dumbbell plot are reported in the Supplementary Material as Table S1, Table S2, and Fig. S1 respectively (see §7 and §6.1–6.2 for the in-text pointers, and </w:t>
+      </w:r>
+      <w:r>
+        <w:rPr>
+          <w:rFonts w:ascii="Times New Roman" w:hAnsi="Times New Roman" w:eastAsia="Times New Roman"/>
+          <w:sz w:val="24"/>
+        </w:rPr>
+        <w:t>submission/supplementary_material.md</w:t>
+      </w:r>
+      <w:r>
+        <w:rPr>
+          <w:rFonts w:ascii="Times New Roman" w:hAnsi="Times New Roman" w:eastAsia="Times New Roman"/>
+          <w:sz w:val="24"/>
+        </w:rPr>
+        <w:t xml:space="preserve"> for the moved content).</w:t>
       </w:r>
     </w:p>
     <w:p>
@@ -1981,7 +1995,7 @@
           <w:rFonts w:ascii="Times New Roman" w:hAnsi="Times New Roman" w:eastAsia="Times New Roman"/>
           <w:sz w:val="24"/>
         </w:rPr>
-        <w:t xml:space="preserve"> The enterprise-vs-institution comparison (Table 7, §7) is descriptive background only, not least because the applicant-type field is entirely missing for four approval years.</w:t>
+        <w:t xml:space="preserve"> The enterprise-vs-institution comparison (Supplementary Table S2, §7) is descriptive background only, not least because the applicant-type field is entirely missing for four approval years.</w:t>
       </w:r>
     </w:p>
     <w:p>
@@ -2956,7 +2970,7 @@
           <w:rFonts w:ascii="Times New Roman" w:hAnsi="Times New Roman" w:eastAsia="Times New Roman"/>
           <w:sz w:val="24"/>
         </w:rPr>
-        <w:t xml:space="preserve"> Fig. 6 shows most of the 17 outcomes balanced within ~2 pp of non-missing rate across arms; the three exceptions (top-two grade, regional-trial yield gain, two-year kg/mu yield) are exactly the three that motivate the Manski-bounds exercise (R7, below).</w:t>
+        <w:t xml:space="preserve"> Supplementary Fig. S1 shows most of the 17 outcomes balanced within ~2 pp of non-missing rate across arms; the three exceptions (top-two grade, regional-trial yield gain, two-year kg/mu yield) are exactly the three that motivate the Manski-bounds exercise (R7, below).</w:t>
       </w:r>
     </w:p>
     <w:p>
@@ -3111,7 +3125,7 @@
           <w:rFonts w:ascii="Times New Roman" w:hAnsi="Times New Roman" w:eastAsia="Times New Roman"/>
           <w:sz w:val="24"/>
         </w:rPr>
-        <w:t xml:space="preserve">Because four outcome variables show meaningfully unbalanced missingness between arms — the top-two quality grade (23.0% missing in the Consortium arm vs 11.3% in Unified), regional-trial yield gain (0.2% vs 11.9%, and separately the 2017 Unified sub-arm at 1.9%), production-trial yield gain, and two-year trial yield in kg/mu (Fig. 6; imbalances ≥ 8 percentage points flagged in orange) — we compute Manski worst-case bounds by filling missing values at the 5th/95th percentile extremes appropriate to each arm. Head-rice percentage and chalkiness degree, whose missingness is balanced (~1–2 pp gap across arms), have narrow, sign-stable bounds ([−2.001, −1.623] and [+0.976, +1.203] respectively) and are treated as the paper's most secure headline results. The top-two quality-grade indicator does </w:t>
+        <w:t xml:space="preserve">Because four outcome variables show meaningfully unbalanced missingness between arms — the top-two quality grade (23.0% missing in the Consortium arm vs 11.3% in Unified), regional-trial yield gain (0.2% vs 11.9%, and separately the 2017 Unified sub-arm at 1.9%), production-trial yield gain, and two-year trial yield in kg/mu (Supplementary Fig. S1; imbalances ≥ 8 percentage points flagged in orange) — we compute Manski worst-case bounds by filling missing values at the 5th/95th percentile extremes appropriate to each arm. Head-rice percentage and chalkiness degree, whose missingness is balanced (~1–2 pp gap across arms), have narrow, sign-stable bounds ([−2.001, −1.623] and [+0.976, +1.203] respectively) and are treated as the paper's most secure headline results. The top-two quality-grade indicator does </w:t>
       </w:r>
       <w:r>
         <w:rPr>
@@ -3613,7 +3627,7 @@
           <w:rFonts w:ascii="Times New Roman" w:hAnsi="Times New Roman" w:eastAsia="Times New Roman"/>
           <w:sz w:val="24"/>
         </w:rPr>
-        <w:t xml:space="preserve"> like the new channel. Winall's own contract-farming business is separately the subject of Xie et al. (2023), which models the seed enterprise's choice of contract design for its order-grain quality incentives with a three-tier supply-chain game and a numerical example, but at the firm level and without any variety-level data; the order-grain revenue-share and gross-margin figures for 2018 and 2021 reported below (Table 6) are drawn from that paper's data rather than from Winall's own disclosures for those two years, and we flag the distinction explicitly here so that this section's variety-level empirical claim is not conflated with Xie et al.'s firm-level contract-theoretic one.</w:t>
+        <w:t xml:space="preserve"> like the new channel. Winall's own contract-farming business is separately the subject of Xie et al. (2023), which models the seed enterprise's choice of contract design for its order-grain quality incentives with a three-tier supply-chain game and a numerical example, but at the firm level and without any variety-level data; the order-grain revenue-share and gross-margin figures for 2018 and 2021 reported below (Supplementary Table S1) are drawn from that paper's data rather than from Winall's own disclosures for those two years, and we flag the distinction explicitly here so that this section's variety-level empirical claim is not conflated with Xie et al.'s firm-level contract-theoretic one.</w:t>
       </w:r>
     </w:p>
     <w:p>
@@ -3626,7 +3640,7 @@
           <w:rFonts w:ascii="Times New Roman" w:hAnsi="Times New Roman" w:eastAsia="Times New Roman"/>
           <w:sz w:val="24"/>
         </w:rPr>
-        <w:t>It is not. Restricting to national approvals in 2017 and 2019–2022, Winall-linked records (n = 166) used the unified channel 60.2% of the time, against 47.5% for all other applicants (n = 1,101) (Table 5; Fig. 7a). A logit for channel choice, conditioning on year×trial-group fixed effects, confirms this is not an artefact of when or where Winall applied: being Winall-linked is associated with roughly half the odds of entering through a new channel (α = −0.728, SE = 0.182, p &lt; 0.0001, odds ratio 0.483; robust in magnitude and sign, though somewhat attenuated, under a no-fixed-effects specification and a two-major-trial-group-only sample). Within the unified channel, Winall's own entrants also outperform other unified entrants on the same third-party-assayed traits that define the main result: head-rice percentage +2.212 points, probability of a stated quality grade +9.8 points, chalkiness −0.692 points (all p &lt; 0.001) (Table 5; Fig. 7b). This within-channel advantage is not a general Winall effect, however: repeating the same comparison inside the new-channel subsample, all three coefficients lose significance (p &gt; 0.18 throughout), and the point estimates move toward zero or reverse sign (Fig. 7b). A firm that were simply better at breeding across the board should retain some of this edge wherever its varieties enter; Winall's edge is specific to the channel in which quality is measured by the same third party as everyone else.</w:t>
+        <w:t>It is not. Restricting to national approvals in 2017 and 2019–2022, Winall-linked records (n = 166) used the unified channel 60.2% of the time, against 47.5% for all other applicants (n = 1,101) (Table 5; Fig. 6a). A logit for channel choice, conditioning on year×trial-group fixed effects, confirms this is not an artefact of when or where Winall applied: being Winall-linked is associated with roughly half the odds of entering through a new channel (α = −0.728, SE = 0.182, p &lt; 0.0001, odds ratio 0.483; robust in magnitude and sign, though somewhat attenuated, under a no-fixed-effects specification and a two-major-trial-group-only sample). Within the unified channel, Winall's own entrants also outperform other unified entrants on the same third-party-assayed traits that define the main result: head-rice percentage +2.212 points, probability of a stated quality grade +9.8 points, chalkiness −0.692 points (all p &lt; 0.001) (Table 5; Fig. 6b). This within-channel advantage is not a general Winall effect, however: repeating the same comparison inside the new-channel subsample, all three coefficients lose significance (p &gt; 0.18 throughout), and the point estimates move toward zero or reverse sign (Fig. 6b). A firm that were simply better at breeding across the board should retain some of this edge wherever its varieties enter; Winall's edge is specific to the channel in which quality is measured by the same third party as everyone else.</w:t>
       </w:r>
     </w:p>
     <w:p>
@@ -3639,7 +3653,7 @@
           <w:rFonts w:ascii="Times New Roman" w:hAnsi="Times New Roman" w:eastAsia="Times New Roman"/>
           <w:sz w:val="24"/>
         </w:rPr>
-        <w:t>This pattern must be read alongside, not instead of, a set of financial facts that are unrelated to which trial channel Winall used but are directly relevant to how the company's overall business should be judged (Table 6; Fig. 7c). Winall's order-grain trading segment — its channel for monetising the grain-quality differentiation documented above — ran a gross margin of approximately 2.66% in 2024, falling to about −0.09% in the first half of 2025 and to −1.31% for full-year 2025. The company's 2025 attributable net profit was −212 million CNY, a swing from profit to loss (down 317.91% year on year). Its 2024 annual report received a qualified (非无保留) audit opinion tied to receivables and inventory audit-scope limitations, and in 2026 the company was fined 3,000,000 CNY (RMB 3 million) for under-provisioning credit-impairment losses in that report (10.86% of disclosed profit) and had its stock short name changed to ST Winall, effective 2026-06-30. China Seed Group's partial tender offer for Winall — first announced 2025-11-20, with the tender period running 2025-12-04 to 2026-01-05 and the resulting 40.51% stake reached only after the tender closed, around 2026-01 — places the company's future ownership in flux at the same time. That Winall's varieties measure better on third-party grain-quality traits inside the unified channel, and that its order-grain business is financially troubled, are two separate and simultaneously true facts about the same firm; neither offsets the other, and this section does not convert the quality-grade coefficients above into any implied revenue, processing value, or cost saving for Winall or its comparators.</w:t>
+        <w:t>This pattern must be read alongside, not instead of, a set of financial facts that are unrelated to which trial channel Winall used but are directly relevant to how the company's overall business should be judged (Supplementary Table S1; Fig. 6c). Winall's order-grain trading segment — its channel for monetising the grain-quality differentiation documented above — ran a gross margin of approximately 2.66% in 2024, falling to about −0.09% in the first half of 2025 and to −1.31% for full-year 2025. The company's 2025 attributable net profit was −212 million CNY, a swing from profit to loss (down 317.91% year on year). Its 2024 annual report received a qualified (非无保留) audit opinion tied to receivables and inventory audit-scope limitations, and in 2026 the company was fined 3,000,000 CNY (RMB 3 million) for under-provisioning credit-impairment losses in that report (10.86% of disclosed profit) and had its stock short name changed to ST Winall, effective 2026-06-30. China Seed Group's partial tender offer for Winall — first announced 2025-11-20, with the tender period running 2025-12-04 to 2026-01-05 and the resulting 40.51% stake reached only after the tender closed, around 2026-01 — places the company's future ownership in flux at the same time. That Winall's varieties measure better on third-party grain-quality traits inside the unified channel, and that its order-grain business is financially troubled, are two separate and simultaneously true facts about the same firm; neither offsets the other, and this section does not convert the quality-grade coefficients above into any implied revenue, processing value, or cost saving for Winall or its comparators.</w:t>
       </w:r>
     </w:p>
     <w:p>
@@ -3665,7 +3679,7 @@
           <w:rFonts w:ascii="Times New Roman" w:hAnsi="Times New Roman" w:eastAsia="Times New Roman"/>
           <w:sz w:val="24"/>
         </w:rPr>
-        <w:t xml:space="preserve">As descriptive background — not as a conclusion about which type of institution breeds better rice — applicants labelled "public research institute" show higher regional-trial yield (+4.179 kg/mu, SE 1.893, p = 0.027, n = 408) and thousand-grain weight (+1.193 g, SE 0.402, p = 0.003, n = 411) than enterprise applicants, alongside directionally higher chalkiness (+1.010, SE 0.614, p = 0.100, n = 411) and lower head-rice percentage (−1.220, SE 0.673, p = 0.070, n = 411) (Table 7). This division of labour runs in the opposite direction from what an "enterprises are careless" account would predict for chalkiness and head-rice, and is silent on causation in either direction; it is reported here only as a background fact, not evidence for or against either institution type. We flag one open item rather than resolving it silently: an earlier planning-stage note for this comparison anticipated a sample of n = 632 records, whereas the regression actually run on </w:t>
+        <w:t xml:space="preserve">As descriptive background — not as a conclusion about which type of institution breeds better rice — applicants labelled "public research institute" show higher regional-trial yield (+4.179 kg/mu, SE 1.893, p = 0.027, n = 408) and thousand-grain weight (+1.193 g, SE 0.402, p = 0.003, n = 411) than enterprise applicants, alongside directionally higher chalkiness (+1.010, SE 0.614, p = 0.100, n = 411) and lower head-rice percentage (−1.220, SE 0.673, p = 0.070, n = 411) (Supplementary Table S2). This division of labour runs in the opposite direction from what an "enterprises are careless" account would predict for chalkiness and head-rice, and is silent on causation in either direction; it is reported here only as a background fact, not evidence for or against either institution type. We flag one open item rather than resolving it silently: an earlier planning-stage note for this comparison anticipated a sample of n = 632 records, whereas the regression actually run on </w:t>
       </w:r>
       <w:r>
         <w:rPr>
@@ -3679,7 +3693,7 @@
           <w:rFonts w:ascii="Times New Roman" w:hAnsi="Times New Roman" w:eastAsia="Times New Roman"/>
           <w:sz w:val="24"/>
         </w:rPr>
-        <w:t xml:space="preserve"> for Table 7 returns n = 408–411 depending on outcome; we were unable to reconstruct the exact filter or sample-construction choice behind the n = 632 figure from the materials available, and record this as an item for the author team to verify against the original coding before submission, rather than adjusting the reported n to match the earlier planning note.</w:t>
+        <w:t xml:space="preserve"> for Supplementary Table S2 (Table 7 in the pre-submission working draft) returns n = 408–411 depending on outcome; we were unable to reconstruct the exact filter or sample-construction choice behind the n = 632 figure from the materials available, and record this as an item for the author team to verify against the original coding before submission, rather than adjusting the reported n to match the earlier planning note.</w:t>
       </w:r>
     </w:p>
     <w:p>

</xml_diff>

<commit_message>
WIP: v3 revision continuing (submission package updates for Winall financial-narrative removal)
Co-Authored-By: Claude Opus 5 <noreply@anthropic.com>
Claude-Session: https://claude.ai/code/session_01CcqZYMkMVHhsffAfbdzjDH
</commit_message>
<xml_diff>
--- a/submission/manuscript.docx
+++ b/submission/manuscript.docx
@@ -1183,7 +1183,7 @@
           <w:rFonts w:ascii="Times New Roman" w:hAnsi="Times New Roman" w:eastAsia="Times New Roman"/>
           <w:sz w:val="24"/>
         </w:rPr>
-        <w:t xml:space="preserve">) assembles a full descriptive and balance summary by arm — means, standard deviations, and missing rates — for all outcome and control variables reported as regression outcomes in Table 3. The main text retains six figures (Fig. 1–6) and five tables (Table 1–5); the Winall financial panel, the enterprise-versus-public-institution descriptive comparison, and the missingness-balance dumbbell plot are reported in the Supplementary Material as Table S1, Table S2, and Fig. S1 respectively (see §7 and §6.1–6.2 for the in-text pointers, and </w:t>
+        <w:t xml:space="preserve">) assembles a full descriptive and balance summary by arm — means, standard deviations, and missing rates — for all outcome and control variables reported as regression outcomes in Table 3. The main text retains six figures (Fig. 1–6) and five tables (Table 1–5); the enterprise-versus-public-institution descriptive comparison and the missingness-balance dumbbell plot are reported in the Supplementary Material as Table S1 and Fig. S1 respectively (see §7 and §6.1–6.2 for the in-text pointers, and </w:t>
       </w:r>
       <w:r>
         <w:rPr>
@@ -1995,7 +1995,7 @@
           <w:rFonts w:ascii="Times New Roman" w:hAnsi="Times New Roman" w:eastAsia="Times New Roman"/>
           <w:sz w:val="24"/>
         </w:rPr>
-        <w:t xml:space="preserve"> The enterprise-vs-institution comparison (Supplementary Table S2, §7) is descriptive background only, not least because the applicant-type field is entirely missing for four approval years.</w:t>
+        <w:t xml:space="preserve"> The enterprise-vs-institution comparison (Supplementary Table S1, §7) is descriptive background only, not least because the applicant-type field is entirely missing for four approval years.</w:t>
       </w:r>
     </w:p>
     <w:p>
@@ -2009,14 +2009,14 @@
           <w:b/>
           <w:sz w:val="24"/>
         </w:rPr>
-        <w:t>We do not claim Winall's quality-oriented positioning has been a financial success.</w:t>
-      </w:r>
-      <w:r>
-        <w:rPr>
-          <w:rFonts w:ascii="Times New Roman" w:hAnsi="Times New Roman" w:eastAsia="Times New Roman"/>
-          <w:sz w:val="24"/>
-        </w:rPr>
-        <w:t xml:space="preserve"> §7 reports its negative order-grain margin, 2025 loss, qualified audit opinion and 2026 penalty in the same discussion as its quality advantage; financial sustainability is treated as open.</w:t>
+        <w:t>This paper does not evaluate the overall financial performance, business strategy, or corporate governance of any applicant firm, including Winall.</w:t>
+      </w:r>
+      <w:r>
+        <w:rPr>
+          <w:rFonts w:ascii="Times New Roman" w:hAnsi="Times New Roman" w:eastAsia="Times New Roman"/>
+          <w:sz w:val="24"/>
+        </w:rPr>
+        <w:t xml:space="preserve"> The channel-choice and within-channel quality comparisons in §7 are silent on firm-level profitability.</w:t>
       </w:r>
     </w:p>
     <w:p>
@@ -3627,7 +3627,7 @@
           <w:rFonts w:ascii="Times New Roman" w:hAnsi="Times New Roman" w:eastAsia="Times New Roman"/>
           <w:sz w:val="24"/>
         </w:rPr>
-        <w:t xml:space="preserve"> like the new channel. Winall's own contract-farming business is separately the subject of Xie et al. (2023), which models the seed enterprise's choice of contract design for its order-grain quality incentives with a three-tier supply-chain game and a numerical example, but at the firm level and without any variety-level data; the order-grain revenue-share and gross-margin figures for 2018 and 2021 reported below (Supplementary Table S1) are drawn from that paper's data rather than from Winall's own disclosures for those two years, and we flag the distinction explicitly here so that this section's variety-level empirical claim is not conflated with Xie et al.'s firm-level contract-theoretic one.</w:t>
+        <w:t xml:space="preserve"> like the new channel. Winall's own contract-farming business is separately the subject of Xie et al. (2023), which models the seed enterprise's choice of contract design for its order-grain quality incentives with a three-tier supply-chain game and a numerical example, but at the firm level and without any variety-level data; this section's own analysis is confined to the variety-level channel-choice and within-channel positioning evidence reported below, and does not draw on or reproduce Xie et al.'s firm-level contract data.</w:t>
       </w:r>
     </w:p>
     <w:p>
@@ -3653,7 +3653,7 @@
           <w:rFonts w:ascii="Times New Roman" w:hAnsi="Times New Roman" w:eastAsia="Times New Roman"/>
           <w:sz w:val="24"/>
         </w:rPr>
-        <w:t>This pattern must be read alongside, not instead of, a set of financial facts that are unrelated to which trial channel Winall used but are directly relevant to how the company's overall business should be judged (Supplementary Table S1; Fig. 6c). Winall's order-grain trading segment — its channel for monetising the grain-quality differentiation documented above — ran a gross margin of approximately 2.66% in 2024, falling to about −0.09% in the first half of 2025 and to −1.31% for full-year 2025. The company's 2025 attributable net profit was −212 million CNY, a swing from profit to loss (down 317.91% year on year). Its 2024 annual report received a qualified (非无保留) audit opinion tied to receivables and inventory audit-scope limitations, and in 2026 the company was fined 3,000,000 CNY (RMB 3 million) for under-provisioning credit-impairment losses in that report (10.86% of disclosed profit) and had its stock short name changed to ST Winall, effective 2026-06-30. China Seed Group's partial tender offer for Winall — first announced 2025-11-20, with the tender period running 2025-12-04 to 2026-01-05 and the resulting 40.51% stake reached only after the tender closed, around 2026-01 — places the company's future ownership in flux at the same time. That Winall's varieties measure better on third-party grain-quality traits inside the unified channel, and that its order-grain business is financially troubled, are two separate and simultaneously true facts about the same firm; neither offsets the other, and this section does not convert the quality-grade coefficients above into any implied revenue, processing value, or cost saving for Winall or its comparators.</w:t>
+        <w:t>Dropping every Winall-linked record from the main consortium-versus-unified comparison leaves the headline result intact (Section 6.1, R10; Table 4): head-rice percentage −1.368 pp (p = 0.006, n = 602), chalkiness degree +0.940 pp (p = 0.034, n = 599), and stated quality grade −0.104 (p = 0.011, n = 609). The main result does not depend on this firm.</w:t>
       </w:r>
     </w:p>
     <w:p>
@@ -3666,20 +3666,7 @@
           <w:rFonts w:ascii="Times New Roman" w:hAnsi="Times New Roman" w:eastAsia="Times New Roman"/>
           <w:sz w:val="24"/>
         </w:rPr>
-        <w:t>Dropping every Winall-linked record from the main consortium-versus-unified comparison leaves the headline result intact (Section 6.1, R10; Table 4): head-rice percentage −1.368 pp (p = 0.006, n = 602), chalkiness degree +0.940 pp (p = 0.034, n = 599), and stated quality grade −0.104 (p = 0.011, n = 609). The main result does not depend on this firm.</w:t>
-      </w:r>
-    </w:p>
-    <w:p>
-      <w:pPr>
-        <w:spacing w:line="480" w:lineRule="auto" w:after="160"/>
-        <w:jc w:val="left"/>
-      </w:pPr>
-      <w:r>
-        <w:rPr>
-          <w:rFonts w:ascii="Times New Roman" w:hAnsi="Times New Roman" w:eastAsia="Times New Roman"/>
-          <w:sz w:val="24"/>
-        </w:rPr>
-        <w:t xml:space="preserve">As descriptive background — not as a conclusion about which type of institution breeds better rice — applicants labelled "public research institute" show higher regional-trial yield (+4.179 kg/mu, SE 1.893, p = 0.027, n = 408) and thousand-grain weight (+1.193 g, SE 0.402, p = 0.003, n = 411) than enterprise applicants, alongside directionally higher chalkiness (+1.010, SE 0.614, p = 0.100, n = 411) and lower head-rice percentage (−1.220, SE 0.673, p = 0.070, n = 411) (Supplementary Table S2). This division of labour runs in the opposite direction from what an "enterprises are careless" account would predict for chalkiness and head-rice, and is silent on causation in either direction; it is reported here only as a background fact, not evidence for or against either institution type. We flag one open item rather than resolving it silently: an earlier planning-stage note for this comparison anticipated a sample of n = 632 records, whereas the regression actually run on </w:t>
+        <w:t xml:space="preserve">As descriptive background — not as a conclusion about which type of institution breeds better rice — applicants labelled "public research institute" show higher regional-trial yield (+4.179 kg/mu, SE 1.893, p = 0.027, n = 408) and thousand-grain weight (+1.193 g, SE 0.402, p = 0.003, n = 411) than enterprise applicants, alongside directionally higher chalkiness (+1.010, SE 0.614, p = 0.100, n = 411) and lower head-rice percentage (−1.220, SE 0.673, p = 0.070, n = 411) (Supplementary Table S1). This division of labour runs in the opposite direction from what an "enterprises are careless" account would predict for chalkiness and head-rice, and is silent on causation in either direction; it is reported here only as a background fact, not evidence for or against either institution type. We flag one open item rather than resolving it silently: an earlier planning-stage note for this comparison anticipated a sample of n = 632 records, whereas the regression actually run on </w:t>
       </w:r>
       <w:r>
         <w:rPr>
@@ -3693,7 +3680,7 @@
           <w:rFonts w:ascii="Times New Roman" w:hAnsi="Times New Roman" w:eastAsia="Times New Roman"/>
           <w:sz w:val="24"/>
         </w:rPr>
-        <w:t xml:space="preserve"> for Supplementary Table S2 (Table 7 in the pre-submission working draft) returns n = 408–411 depending on outcome; we were unable to reconstruct the exact filter or sample-construction choice behind the n = 632 figure from the materials available, and record this as an item for the author team to verify against the original coding before submission, rather than adjusting the reported n to match the earlier planning note.</w:t>
+        <w:t xml:space="preserve"> for Supplementary Table S1 (Table 7 in the pre-submission working draft) returns n = 408–411 depending on outcome; we were unable to reconstruct the exact filter or sample-construction choice behind the n = 632 figure from the materials available, and record this as an item for the author team to verify against the original coding before submission, rather than adjusting the reported n to match the earlier planning note.</w:t>
       </w:r>
     </w:p>
     <w:p>
@@ -4332,7 +4319,7 @@
           <w:rFonts w:ascii="Times New Roman" w:hAnsi="Times New Roman" w:eastAsia="Times New Roman"/>
           <w:sz w:val="24"/>
         </w:rPr>
-        <w:t>Not applicable. This study did not involve human participants or animal experiments; it uses only publicly available government variety-approval announcements and publicly disclosed company financial filings.</w:t>
+        <w:t>Not applicable. This study did not involve human participants or animal experiments; it uses only publicly available government variety-approval announcements.</w:t>
       </w:r>
     </w:p>
     <w:p>

</xml_diff>

<commit_message>
v4: correct change-log counts and rebuild submission package
Fixes two self-report errors in the v3-to-v4 change log: the manuscript word count
(15,609 to the actual 15,665 by wc -w) and the reference-list count (18 to 24 entries,
with references_verified.md going from 21 to 27 verified records).

Rebuilds submission/manuscript.docx and manuscript.pdf from manuscript_v4.md so the
package carries the new title, and updates VERSION_HISTORY and the submission
checklist with the v4 entry.

Co-Authored-By: Claude Opus 5 <noreply@anthropic.com>
Claude-Session: https://claude.ai/code/session_01CcqZYMkMVHhsffAfbdzjDH
</commit_message>
<xml_diff>
--- a/submission/manuscript.docx
+++ b/submission/manuscript.docx
@@ -13,7 +13,7 @@
           <w:b/>
           <w:sz w:val="28"/>
         </w:rPr>
-        <w:t>Who measures what enters the market? Self-organised variety trials and the third-party-assayed grain-quality gap in China's rice variety approvals, 2017–2022</w:t>
+        <w:t>Mining administrative approval records for technology assessment: record-level trial-channel indicators and third-party-assayed grain quality in China's rice variety registrations, 2017–2022</w:t>
       </w:r>
     </w:p>
     <w:p>
@@ -34,7 +34,7 @@
           <w:rFonts w:ascii="Times New Roman" w:hAnsi="Times New Roman" w:eastAsia="Times New Roman"/>
           <w:sz w:val="24"/>
         </w:rPr>
-        <w:t xml:space="preserve"> Trial channels and third-party grain quality in Chinese rice approvals</w:t>
+        <w:t xml:space="preserve"> Mining approval records for trial-channel indicators of rice quality</w:t>
       </w:r>
     </w:p>
     <w:p>
@@ -62,22 +62,7 @@
           <w:rFonts w:ascii="Times New Roman" w:hAnsi="Times New Roman" w:eastAsia="Times New Roman"/>
           <w:sz w:val="24"/>
         </w:rPr>
-        <w:t xml:space="preserve">China's 2016 revision of the </w:t>
-      </w:r>
-      <w:r>
-        <w:rPr>
-          <w:rFonts w:ascii="Times New Roman" w:hAnsi="Times New Roman" w:eastAsia="Times New Roman"/>
-          <w:i/>
-          <w:sz w:val="24"/>
-        </w:rPr>
-        <w:t>Measures for the Administration of Crop Variety Approval</w:t>
-      </w:r>
-      <w:r>
-        <w:rPr>
-          <w:rFonts w:ascii="Times New Roman" w:hAnsi="Times New Roman" w:eastAsia="Times New Roman"/>
-          <w:sz w:val="24"/>
-        </w:rPr>
-        <w:t xml:space="preserve"> ended the state monopoly on variety-value testing: certified seed firms may run green-channel trials, and consortia of five or more breeders may organise regional trials. Whether this changed what enters the seed market, not only how much, is unknown, because no prior study observes which trial channel a variety passed through. We exploit an unused feature of official approval announcements, which name the trial each variety was tested in, to assign every record to the unified trial, the green channel, or a consortium trial. Using rice approval records parsed from Ministry announcements, we compare self-organised with unified-trial entrants within the same approval year, ecological trial group and named check, estimating the green channel (2017) and consortium trials (2019–2022) as separate treatments since they do not overlap in time. Consortium entrants show 1.84 percentage points lower head-rice percentage, 1.11 points higher chalkiness, and a 12.2-point lower probability of carrying a stated national quality grade, all third-party-assayed under NY/T 593, while the yield advantage recorded in the applicant's own trial is, if anything, higher (+0.55 points, suggestive only); green-channel entrants likewise show higher chalkiness. This sign separation is the identification argument: a pure breeding-ability account predicts both trait classes deteriorate together, whereas third-party grain quality deteriorates while applicant-measured performance does not. Results survive worst-case bounds, randomisation inference, and dropping the focal firm. Bacterial-blight grades are better, not worse, among self-organised entrants, a result that bounds the composition effect.</w:t>
+        <w:t>Official approval announcements are a long-public but unexploited intelligence source, recording who tested a technology and what a third party measured. We mine China's rice variety-approval announcements into a record-level indicator system (2,386 records, 17 fields) and extract an unused element: each variety's trial channel. China's 2016 approval reform let seed firms and breeder consortia run their own trials, but no prior study observes the channel, so none can tell whether what enters the market changed. We compare self-organised with unified-trial entrants within the same approval year, ecological trial group and named check, estimating the green channel (2017) and consortium trials (2019–2022) as separate treatments since they do not overlap in time. Consortium entrants show 1.84 percentage points lower head-rice percentage, 1.11 points higher chalkiness, and a 12.2-point lower probability of carrying a stated national quality grade, all third-party-assayed under NY/T 593, while the yield advantage recorded in the applicant's own trial is, if anything, higher (+0.55 points, suggestive only); green-channel entrants likewise show higher chalkiness. This sign separation is the identification argument: a pure breeding-ability account predicts both trait classes deteriorate together, whereas third-party grain quality deteriorates while applicant-measured performance does not. Results survive worst-case bounds, randomisation inference, and dropping the focal firm. Bacterial-blight grades are better, not worse, among self-organised entrants, a result that bounds the composition effect. Methodologically, evidence strength differs across fields of one official source according to who measured each field, a diagnostic that transfers to drug approval, device registration and patent examination corpora.</w:t>
       </w:r>
     </w:p>
     <w:p>
@@ -105,7 +90,7 @@
           <w:rFonts w:ascii="Times New Roman" w:hAnsi="Times New Roman" w:eastAsia="Times New Roman"/>
           <w:sz w:val="24"/>
         </w:rPr>
-        <w:t>variety approval; third-party certification; self-organised trials; rice quality; seed regulation; China</w:t>
+        <w:t>administrative text mining; technology assessment; information extraction; data provenance; rice variety approval; China</w:t>
       </w:r>
     </w:p>
     <w:p>
@@ -133,7 +118,7 @@
           <w:rFonts w:ascii="Times New Roman" w:hAnsi="Times New Roman" w:eastAsia="Times New Roman"/>
           <w:sz w:val="24"/>
         </w:rPr>
-        <w:t>Trial channel is reconstructed from approval-announcement text at record level.</w:t>
+        <w:t>Administrative approval text is mined into a record-level innovation indicator set.</w:t>
       </w:r>
     </w:p>
     <w:p>
@@ -146,7 +131,7 @@
           <w:rFonts w:ascii="Times New Roman" w:hAnsi="Times New Roman" w:eastAsia="Times New Roman"/>
           <w:sz w:val="24"/>
         </w:rPr>
-        <w:t>Consortium-trial entrants show lower third-party-assayed grain quality.</w:t>
+        <w:t>Trial channel is reconstructed from approval-announcement text at record level.</w:t>
       </w:r>
     </w:p>
     <w:p>
@@ -159,7 +144,7 @@
           <w:rFonts w:ascii="Times New Roman" w:hAnsi="Times New Roman" w:eastAsia="Times New Roman"/>
           <w:sz w:val="24"/>
         </w:rPr>
-        <w:t>Applicant-measured yield performance is not lower for self-organised entrants.</w:t>
+        <w:t>Consortium-trial entrants show lower third-party-assayed grain quality.</w:t>
       </w:r>
     </w:p>
     <w:p>
@@ -172,7 +157,7 @@
           <w:rFonts w:ascii="Times New Roman" w:hAnsi="Times New Roman" w:eastAsia="Times New Roman"/>
           <w:sz w:val="24"/>
         </w:rPr>
-        <w:t>Green-channel and consortium-trial gaps diverge and are estimated separately.</w:t>
+        <w:t>Applicant-measured yield performance is not lower for self-organised entrants.</w:t>
       </w:r>
     </w:p>
     <w:p>
@@ -185,7 +170,7 @@
           <w:rFonts w:ascii="Times New Roman" w:hAnsi="Times New Roman" w:eastAsia="Times New Roman"/>
           <w:sz w:val="24"/>
         </w:rPr>
-        <w:t>A leading seed firm uses self-organised trials less, against low breeding capacity.</w:t>
+        <w:t>Evidence strength varies across fields of one source with who measured the field.</w:t>
       </w:r>
     </w:p>
     <w:p>
@@ -213,7 +198,7 @@
           <w:rFonts w:ascii="Times New Roman" w:hAnsi="Times New Roman" w:eastAsia="Times New Roman"/>
           <w:sz w:val="24"/>
         </w:rPr>
-        <w:t xml:space="preserve">Variety approval decides which rice varieties may be sold as certified seed in China, and until 2016 the government held a monopoly on the trials that produced this decision: every candidate variety was measured, under the same protocol, in the state-run unified regional trial. The 2016 revision of the </w:t>
+        <w:t xml:space="preserve">Variety approval decides which rice varieties may be sold as certified seed in China. Until 2016 the state held a monopoly on the trials that produced this decision; the 2016 revision of the </w:t>
       </w:r>
       <w:r>
         <w:rPr>
@@ -228,7 +213,7 @@
           <w:rFonts w:ascii="Times New Roman" w:hAnsi="Times New Roman" w:eastAsia="Times New Roman"/>
           <w:sz w:val="24"/>
         </w:rPr>
-        <w:t xml:space="preserve"> ended that monopoly. Certified integrated seed-breeding-extension enterprises could now organise their own "green-channel" trials, and consortia of five or more breeders could organise their own regional trials. Both channels replace the government as the party that runs the trial in which agronomic performance is measured; neither channel replaces the ministry-designated third-party laboratories that measure grain-processing and appearance quality once a candidate reaches the approval stage. This split — self-organised measurement of performance, third-party measurement of quality, inside the same approval file — is the object of this paper. We ask not how large the reform was, but </w:t>
+        <w:t xml:space="preserve"> ended it, letting certified integrated seed-breeding-extension enterprises run their own "green-channel" trials and consortia of five or more breeders organise their own regional trials. Both channels replace the government as the party that runs the trial in which agronomic performance is measured; neither replaces the ministry-designated third-party laboratories that measure grain-processing and appearance quality once a candidate reaches the approval stage. This split — self-organised measurement of performance, third-party measurement of quality, inside the same approval file — is the object of this paper. We ask not how large the reform was, but </w:t>
       </w:r>
       <w:r>
         <w:rPr>
@@ -256,52 +241,7 @@
           <w:rFonts w:ascii="Times New Roman" w:hAnsi="Times New Roman" w:eastAsia="Times New Roman"/>
           <w:sz w:val="24"/>
         </w:rPr>
-        <w:t xml:space="preserve">This question has not been answered because it has not been asked in a form the data could answer. The two studies that evaluate this same reform, Xiang et al. (2025) and Zhao et al. (2022), both code the reform as a </w:t>
-      </w:r>
-      <w:r>
-        <w:rPr>
-          <w:rFonts w:ascii="Times New Roman" w:hAnsi="Times New Roman" w:eastAsia="Times New Roman"/>
-          <w:i/>
-          <w:sz w:val="24"/>
-        </w:rPr>
-        <w:t>period</w:t>
-      </w:r>
-      <w:r>
-        <w:rPr>
-          <w:rFonts w:ascii="Times New Roman" w:hAnsi="Times New Roman" w:eastAsia="Times New Roman"/>
-          <w:sz w:val="24"/>
-        </w:rPr>
-        <w:t xml:space="preserve"> variable — before versus after 2016 — applied to licensing-fee data and to national approval panels, respectively. Xiang et al. (2025) find that licensing fees for hybrid rice varieties are not significantly affected by the reform; Zhao et al. (2022) trace policy variables against approved-variety trait trends over time. Neither paper observes which trial a given variety actually passed through, so neither can distinguish a change in </w:t>
-      </w:r>
-      <w:r>
-        <w:rPr>
-          <w:rFonts w:ascii="Times New Roman" w:hAnsi="Times New Roman" w:eastAsia="Times New Roman"/>
-          <w:i/>
-          <w:sz w:val="24"/>
-        </w:rPr>
-        <w:t>how much</w:t>
-      </w:r>
-      <w:r>
-        <w:rPr>
-          <w:rFonts w:ascii="Times New Roman" w:hAnsi="Times New Roman" w:eastAsia="Times New Roman"/>
-          <w:sz w:val="24"/>
-        </w:rPr>
-        <w:t xml:space="preserve"> enters the market from a change in </w:t>
-      </w:r>
-      <w:r>
-        <w:rPr>
-          <w:rFonts w:ascii="Times New Roman" w:hAnsi="Times New Roman" w:eastAsia="Times New Roman"/>
-          <w:i/>
-          <w:sz w:val="24"/>
-        </w:rPr>
-        <w:t>what</w:t>
-      </w:r>
-      <w:r>
-        <w:rPr>
-          <w:rFonts w:ascii="Times New Roman" w:hAnsi="Times New Roman" w:eastAsia="Times New Roman"/>
-          <w:sz w:val="24"/>
-        </w:rPr>
-        <w:t xml:space="preserve"> enters it. A null effect on price, in particular, is silent on whether the composition of entering varieties shifted. This is the gap: no existing study has a record-level channel variable to test whether self-organised and state-run entrants differ in what they bring to market.</w:t>
+        <w:t>The documents in which that split can be observed belong to a class of evidence that science-and-technology (S&amp;T) intelligence work has barely touched. Innovation measurement still rests overwhelmingly on a few curated indicator families — publications, patents and, more recently, trademarks and firm web traces — and the methodological literature is concentrated in the same place: text mining in innovation research has been developed and surveyed almost entirely over patent and publication corpora (Losiewicz et al., 2000; Antons et al., 2020), and even the recent turn to "big data" firm-level indicators draws mainly on web, job-posting and transaction traces rather than on the regulatory record (Rammer and Es-Sadki, 2023). Administrative approval and registration records — the documents a state produces when it decides that a technology may be placed on the market — sit outside this frame, not because they are secret but because they are unstructured: they are published as running prose, one announcement at a time, and must be parsed before they can be counted. Crop variety approval announcements are among the most information-dense members of this class. A single record carries the applicant, the trial the variety was tested in, the named check it was compared against, and more than a dozen measured agronomic, grain-quality and resistance fields, each with an identifiable measuring party. The first contribution of this paper is accordingly a methodological one for S&amp;T intelligence: we convert this long-public corpus into a structured, record-level indicator system, and then show what technology assessment that system supports.</w:t>
       </w:r>
     </w:p>
     <w:p>
@@ -314,7 +254,7 @@
           <w:rFonts w:ascii="Times New Roman" w:hAnsi="Times New Roman" w:eastAsia="Times New Roman"/>
           <w:sz w:val="24"/>
         </w:rPr>
-        <w:t xml:space="preserve">A related but distinct literature reads approved-variety trait trends by </w:t>
+        <w:t xml:space="preserve">This question has not been answered because it has not been asked in a form the data could answer. The two studies that evaluate this same reform, Xiang et al. (2025) and Zhao et al. (2022), both code the reform as a </w:t>
       </w:r>
       <w:r>
         <w:rPr>
@@ -322,14 +262,14 @@
           <w:i/>
           <w:sz w:val="24"/>
         </w:rPr>
-        <w:t>calendar year</w:t>
-      </w:r>
-      <w:r>
-        <w:rPr>
-          <w:rFonts w:ascii="Times New Roman" w:hAnsi="Times New Roman" w:eastAsia="Times New Roman"/>
-          <w:sz w:val="24"/>
-        </w:rPr>
-        <w:t xml:space="preserve"> rather than by trial channel. Lu et al. (2024) classify the quality-trait trajectory of 17,785 nationally and provincially approved varieties from 1978–2022, and Hang et al. (2024) track yield and agronomic-trait evolution across 11,811 regional-trial entries from 1990–2023; both papers read the same kind of approval-trial record we use, but neither carries a variable for which trial organised the test, so both attribute trait change to </w:t>
+        <w:t>period</w:t>
+      </w:r>
+      <w:r>
+        <w:rPr>
+          <w:rFonts w:ascii="Times New Roman" w:hAnsi="Times New Roman" w:eastAsia="Times New Roman"/>
+          <w:sz w:val="24"/>
+        </w:rPr>
+        <w:t xml:space="preserve"> variable — before versus after 2016 — applied to licensing-fee data and to national approval panels, respectively. Xiang et al. (2025) find that licensing fees for hybrid rice varieties are not significantly affected by the reform; Zhao et al. (2022) trace policy variables against approved-variety trait trends over time. Neither paper observes which trial a given variety actually passed through, so neither can distinguish a change in </w:t>
       </w:r>
       <w:r>
         <w:rPr>
@@ -337,14 +277,14 @@
           <w:i/>
           <w:sz w:val="24"/>
         </w:rPr>
-        <w:t>when</w:t>
-      </w:r>
-      <w:r>
-        <w:rPr>
-          <w:rFonts w:ascii="Times New Roman" w:hAnsi="Times New Roman" w:eastAsia="Times New Roman"/>
-          <w:sz w:val="24"/>
-        </w:rPr>
-        <w:t xml:space="preserve"> a variety was approved rather than to </w:t>
+        <w:t>how much</w:t>
+      </w:r>
+      <w:r>
+        <w:rPr>
+          <w:rFonts w:ascii="Times New Roman" w:hAnsi="Times New Roman" w:eastAsia="Times New Roman"/>
+          <w:sz w:val="24"/>
+        </w:rPr>
+        <w:t xml:space="preserve"> enters the market from a change in </w:t>
       </w:r>
       <w:r>
         <w:rPr>
@@ -352,14 +292,14 @@
           <w:i/>
           <w:sz w:val="24"/>
         </w:rPr>
-        <w:t>which door</w:t>
-      </w:r>
-      <w:r>
-        <w:rPr>
-          <w:rFonts w:ascii="Times New Roman" w:hAnsi="Times New Roman" w:eastAsia="Times New Roman"/>
-          <w:sz w:val="24"/>
-        </w:rPr>
-        <w:t xml:space="preserve"> it entered through. This paper's structural-break analysis (§5.6) and the "closing window" discussion (§8.2) speak to the same substantive object — the trajectory of quality and yield traits in China's approval records — but ask a channel-conditional question that a year-indexed reading cannot: whether the pre-2016 quality trend Lu et al. (2024) and Hang et al. (2024) document already contains the same channel a variety passed through, or whether it is orthogonal to channel altogether. A recent title-level review of fifty years of three-line hybrid rice trends (Gong et al., 2026) situates this same trait trajectory over a longer horizon; because the full text of that review was not accessible to us at the time of writing, we cite it only for its scope and do not attribute any specific figure to it.</w:t>
+        <w:t>what</w:t>
+      </w:r>
+      <w:r>
+        <w:rPr>
+          <w:rFonts w:ascii="Times New Roman" w:hAnsi="Times New Roman" w:eastAsia="Times New Roman"/>
+          <w:sz w:val="24"/>
+        </w:rPr>
+        <w:t xml:space="preserve"> enters it. A null effect on price, in particular, is silent on whether the composition of entering varieties shifted. This is the gap: no existing study has a record-level channel variable to test whether self-organised and state-run entrants differ in what they bring to market.</w:t>
       </w:r>
     </w:p>
     <w:p>
@@ -372,7 +312,52 @@
           <w:rFonts w:ascii="Times New Roman" w:hAnsi="Times New Roman" w:eastAsia="Times New Roman"/>
           <w:sz w:val="24"/>
         </w:rPr>
-        <w:t>We close this gap using a feature of the official approval announcements that has not previously been exploited: each announcement states, in its own text, the name of the trial in which the variety was tested — the unified regional trial, the green channel, or a named consortium trial. Parsing this text lets us assign every approval record to a channel and compare self-organised entrants with unified-trial entrants within the same approval year, the same ecological trial group, and the same named check variety. Because the green channel is concentrated in a single year (2017) and consortium trials begin only in 2019, the two channels barely overlap in time; we treat them as two separate treatments rather than pooling them into one "new channel."</w:t>
+        <w:t xml:space="preserve">A related but distinct literature reads approved-variety trait trends by </w:t>
+      </w:r>
+      <w:r>
+        <w:rPr>
+          <w:rFonts w:ascii="Times New Roman" w:hAnsi="Times New Roman" w:eastAsia="Times New Roman"/>
+          <w:i/>
+          <w:sz w:val="24"/>
+        </w:rPr>
+        <w:t>calendar year</w:t>
+      </w:r>
+      <w:r>
+        <w:rPr>
+          <w:rFonts w:ascii="Times New Roman" w:hAnsi="Times New Roman" w:eastAsia="Times New Roman"/>
+          <w:sz w:val="24"/>
+        </w:rPr>
+        <w:t xml:space="preserve"> rather than by trial channel. Lu et al. (2024) classify the quality-trait trajectory of 17,785 nationally and provincially approved varieties from 1978–2022, and Hang et al. (2024) track yield and agronomic-trait evolution across 11,811 regional-trial entries from 1990–2023; both papers read the same kind of approval-trial record we use, but neither carries a variable for which trial organised the test, so both attribute trait change to </w:t>
+      </w:r>
+      <w:r>
+        <w:rPr>
+          <w:rFonts w:ascii="Times New Roman" w:hAnsi="Times New Roman" w:eastAsia="Times New Roman"/>
+          <w:i/>
+          <w:sz w:val="24"/>
+        </w:rPr>
+        <w:t>when</w:t>
+      </w:r>
+      <w:r>
+        <w:rPr>
+          <w:rFonts w:ascii="Times New Roman" w:hAnsi="Times New Roman" w:eastAsia="Times New Roman"/>
+          <w:sz w:val="24"/>
+        </w:rPr>
+        <w:t xml:space="preserve"> a variety was approved rather than to </w:t>
+      </w:r>
+      <w:r>
+        <w:rPr>
+          <w:rFonts w:ascii="Times New Roman" w:hAnsi="Times New Roman" w:eastAsia="Times New Roman"/>
+          <w:i/>
+          <w:sz w:val="24"/>
+        </w:rPr>
+        <w:t>which door</w:t>
+      </w:r>
+      <w:r>
+        <w:rPr>
+          <w:rFonts w:ascii="Times New Roman" w:hAnsi="Times New Roman" w:eastAsia="Times New Roman"/>
+          <w:sz w:val="24"/>
+        </w:rPr>
+        <w:t xml:space="preserve"> it entered through. This paper's structural-break analysis (§5.6) and the "closing window" discussion (§8.2) speak to the same substantive object — the trajectory of quality and yield traits in China's approval records — but ask a channel-conditional question that a year-indexed reading cannot: whether the pre-2016 quality trend Lu et al. (2024) and Hang et al. (2024) document already contains the same channel a variety passed through, or whether it is orthogonal to channel altogether. A recent title-level review of fifty years of three-line hybrid rice trends (Gong et al., 2026) situates this same trait trajectory over a longer horizon; because the full text of that review was not accessible to us at the time of writing, we cite it only for its scope and do not attribute any specific figure to it.</w:t>
       </w:r>
     </w:p>
     <w:p>
@@ -385,52 +370,7 @@
           <w:rFonts w:ascii="Times New Roman" w:hAnsi="Times New Roman" w:eastAsia="Times New Roman"/>
           <w:sz w:val="24"/>
         </w:rPr>
-        <w:t xml:space="preserve">The paper's estimand is a </w:t>
-      </w:r>
-      <w:r>
-        <w:rPr>
-          <w:rFonts w:ascii="Times New Roman" w:hAnsi="Times New Roman" w:eastAsia="Times New Roman"/>
-          <w:b/>
-          <w:sz w:val="24"/>
-        </w:rPr>
-        <w:t>composition effect on the entering population</w:t>
-      </w:r>
-      <w:r>
-        <w:rPr>
-          <w:rFonts w:ascii="Times New Roman" w:hAnsi="Times New Roman" w:eastAsia="Times New Roman"/>
-          <w:sz w:val="24"/>
-        </w:rPr>
-        <w:t xml:space="preserve">: conditional on year, trial group and check, how do the traits of varieties entering through a self-organised channel differ from those entering through the unified trial. This is not the effect of moving one variety from one channel to the other, since channel assignment is not random and applicants self-select into it; it is the difference in what each door lets through. We do not estimate, and do not claim, a causal effect of the reform on trait levels, and we do not claim that the reform caused any decline in grain quality — the identification strategy below concerns the </w:t>
-      </w:r>
-      <w:r>
-        <w:rPr>
-          <w:rFonts w:ascii="Times New Roman" w:hAnsi="Times New Roman" w:eastAsia="Times New Roman"/>
-          <w:i/>
-          <w:sz w:val="24"/>
-        </w:rPr>
-        <w:t>entering population</w:t>
-      </w:r>
-      <w:r>
-        <w:rPr>
-          <w:rFonts w:ascii="Times New Roman" w:hAnsi="Times New Roman" w:eastAsia="Times New Roman"/>
-          <w:sz w:val="24"/>
-        </w:rPr>
-        <w:t xml:space="preserve">, not the </w:t>
-      </w:r>
-      <w:r>
-        <w:rPr>
-          <w:rFonts w:ascii="Times New Roman" w:hAnsi="Times New Roman" w:eastAsia="Times New Roman"/>
-          <w:i/>
-          <w:sz w:val="24"/>
-        </w:rPr>
-        <w:t>time trend</w:t>
-      </w:r>
-      <w:r>
-        <w:rPr>
-          <w:rFonts w:ascii="Times New Roman" w:hAnsi="Times New Roman" w:eastAsia="Times New Roman"/>
-          <w:sz w:val="24"/>
-        </w:rPr>
-        <w:t>.</w:t>
+        <w:t>We close this gap using a feature of the official approval announcements that has not previously been exploited: each announcement states, in its own text, the name of the trial in which the variety was tested — the unified regional trial, the green channel, or a named consortium trial. Parsing this text lets us assign every approval record to a channel and compare self-organised entrants with unified-trial entrants within the same approval year, the same ecological trial group, and the same named check variety. Because the green channel is concentrated in a single year (2017) and consortium trials begin only in 2019, the two channels barely overlap in time; we treat them as two separate treatments rather than pooling them into one "new channel."</w:t>
       </w:r>
     </w:p>
     <w:p>
@@ -443,7 +383,22 @@
           <w:rFonts w:ascii="Times New Roman" w:hAnsi="Times New Roman" w:eastAsia="Times New Roman"/>
           <w:sz w:val="24"/>
         </w:rPr>
-        <w:t xml:space="preserve">The identification argument that makes this composition gap informative rests on where the two trait classes are measured. Grain-processing and appearance quality — head-rice percentage, chalkiness, and the national quality grade — are measured after approval by ministry-designated third-party laboratories under the industry standard NY/T 593, uniformly across channels. Agronomic performance in the regional and production trials — yield and the reported yield gain over the check — is measured by the applicant's own trial organisation when the channel is self-organised. A pure difference in applicant breeding ability predicts that both trait classes move together: weaker applicants would enter with worse quality </w:t>
+        <w:t xml:space="preserve">The paper's estimand is a </w:t>
+      </w:r>
+      <w:r>
+        <w:rPr>
+          <w:rFonts w:ascii="Times New Roman" w:hAnsi="Times New Roman" w:eastAsia="Times New Roman"/>
+          <w:b/>
+          <w:sz w:val="24"/>
+        </w:rPr>
+        <w:t>composition effect on the entering population</w:t>
+      </w:r>
+      <w:r>
+        <w:rPr>
+          <w:rFonts w:ascii="Times New Roman" w:hAnsi="Times New Roman" w:eastAsia="Times New Roman"/>
+          <w:sz w:val="24"/>
+        </w:rPr>
+        <w:t xml:space="preserve">: conditional on year, trial group and check, how do the traits of varieties entering through a self-organised channel differ from those entering through the unified trial. This is not the effect of moving one variety from one channel to the other, since channel assignment is not random and applicants self-select into it; it is the difference in what each door lets through. We do not estimate, and do not claim, a causal effect of the reform on trait levels, and we do not claim that the reform caused any decline in grain quality — the identification strategy below concerns the </w:t>
       </w:r>
       <w:r>
         <w:rPr>
@@ -451,14 +406,29 @@
           <w:i/>
           <w:sz w:val="24"/>
         </w:rPr>
-        <w:t>and</w:t>
-      </w:r>
-      <w:r>
-        <w:rPr>
-          <w:rFonts w:ascii="Times New Roman" w:hAnsi="Times New Roman" w:eastAsia="Times New Roman"/>
-          <w:sz w:val="24"/>
-        </w:rPr>
-        <w:t xml:space="preserve"> worse performance. We instead find a sign separation: consortium entrants show 1.84 percentage points lower head-rice percentage, 1.11 points higher chalkiness, and a 12.2-point lower probability of carrying a stated national quality grade (n = 742/739/750) — all third-party-assayed — while the applicant-measured yield gain is, if anything, higher rather than lower. A breeding-ability account cannot generate this pattern; only an account in which the two trait classes are measured by different parties, or the two channels apply different thresholds, can. We report this sign separation as the paper's identification argument, not as a discussion-section aside, and we are explicit that it cannot on its own distinguish measurement discretion from a difference in channel-specific admission thresholds.</w:t>
+        <w:t>entering population</w:t>
+      </w:r>
+      <w:r>
+        <w:rPr>
+          <w:rFonts w:ascii="Times New Roman" w:hAnsi="Times New Roman" w:eastAsia="Times New Roman"/>
+          <w:sz w:val="24"/>
+        </w:rPr>
+        <w:t xml:space="preserve">, not the </w:t>
+      </w:r>
+      <w:r>
+        <w:rPr>
+          <w:rFonts w:ascii="Times New Roman" w:hAnsi="Times New Roman" w:eastAsia="Times New Roman"/>
+          <w:i/>
+          <w:sz w:val="24"/>
+        </w:rPr>
+        <w:t>time trend</w:t>
+      </w:r>
+      <w:r>
+        <w:rPr>
+          <w:rFonts w:ascii="Times New Roman" w:hAnsi="Times New Roman" w:eastAsia="Times New Roman"/>
+          <w:sz w:val="24"/>
+        </w:rPr>
+        <w:t>.</w:t>
       </w:r>
     </w:p>
     <w:p>
@@ -471,7 +441,22 @@
           <w:rFonts w:ascii="Times New Roman" w:hAnsi="Times New Roman" w:eastAsia="Times New Roman"/>
           <w:sz w:val="24"/>
         </w:rPr>
-        <w:t>This paper makes three contributions.</w:t>
+        <w:t xml:space="preserve">The identification argument that makes this composition gap informative rests on where the two trait classes are measured. Grain-processing and appearance quality — head-rice percentage, chalkiness, and the national quality grade — are measured after approval by ministry-designated third-party laboratories under the industry standard NY/T 593, uniformly across channels. Agronomic performance in the regional and production trials — yield and the reported yield gain over the check — is measured by the applicant's own trial organisation when the channel is self-organised. A pure difference in applicant breeding ability predicts that both trait classes move together: weaker applicants would enter with worse quality </w:t>
+      </w:r>
+      <w:r>
+        <w:rPr>
+          <w:rFonts w:ascii="Times New Roman" w:hAnsi="Times New Roman" w:eastAsia="Times New Roman"/>
+          <w:i/>
+          <w:sz w:val="24"/>
+        </w:rPr>
+        <w:t>and</w:t>
+      </w:r>
+      <w:r>
+        <w:rPr>
+          <w:rFonts w:ascii="Times New Roman" w:hAnsi="Times New Roman" w:eastAsia="Times New Roman"/>
+          <w:sz w:val="24"/>
+        </w:rPr>
+        <w:t xml:space="preserve"> worse performance. We instead find a sign separation: consortium entrants show 1.84 percentage points lower head-rice percentage, 1.11 points higher chalkiness, and a 12.2-point lower probability of carrying a stated national quality grade (n = 742/739/750) — all third-party-assayed — while the applicant-measured yield gain is, if anything, higher rather than lower. A breeding-ability account cannot generate this pattern; only an account in which the two trait classes are measured by different parties, or the two channels apply different thresholds, can. We report this sign separation as the paper's identification argument, not as a discussion-section aside, and we are explicit that it cannot on its own distinguish measurement discretion from a difference in channel-specific admission thresholds.</w:t>
       </w:r>
     </w:p>
     <w:p>
@@ -482,17 +467,9 @@
       <w:r>
         <w:rPr>
           <w:rFonts w:ascii="Times New Roman" w:hAnsi="Times New Roman" w:eastAsia="Times New Roman"/>
-          <w:b/>
-          <w:sz w:val="24"/>
-        </w:rPr>
-        <w:t>First</w:t>
-      </w:r>
-      <w:r>
-        <w:rPr>
-          <w:rFonts w:ascii="Times New Roman" w:hAnsi="Times New Roman" w:eastAsia="Times New Roman"/>
-          <w:sz w:val="24"/>
-        </w:rPr>
-        <w:t>, it constructs the first record-level trial-channel variable for China's variety approval system, built directly from the wording of official approval announcements rather than from a before/after period indicator. This turns "the 2016 reform" from a single time-varying treatment into an observable, record-level assignment that can be compared within year, trial group and check — the design that Xiang et al. (2025) and Zhao et al. (2022) could not implement without this variable.</w:t>
+          <w:sz w:val="24"/>
+        </w:rPr>
+        <w:t>This paper makes three contributions.</w:t>
       </w:r>
     </w:p>
     <w:p>
@@ -506,29 +483,14 @@
           <w:b/>
           <w:sz w:val="24"/>
         </w:rPr>
-        <w:t>Second</w:t>
-      </w:r>
-      <w:r>
-        <w:rPr>
-          <w:rFonts w:ascii="Times New Roman" w:hAnsi="Times New Roman" w:eastAsia="Times New Roman"/>
-          <w:sz w:val="24"/>
-        </w:rPr>
-        <w:t xml:space="preserve">, it turns the coexistence of applicant-measured and third-party-measured traits within the same approval file into an identification argument, rather than a description. The regulatory-economics literature on self-certification has shown, experimentally, that a regulated party's own choice of auditor yields systematically favourable readings of the </w:t>
-      </w:r>
-      <w:r>
-        <w:rPr>
-          <w:rFonts w:ascii="Times New Roman" w:hAnsi="Times New Roman" w:eastAsia="Times New Roman"/>
-          <w:i/>
-          <w:sz w:val="24"/>
-        </w:rPr>
-        <w:t>same</w:t>
-      </w:r>
-      <w:r>
-        <w:rPr>
-          <w:rFonts w:ascii="Times New Roman" w:hAnsi="Times New Roman" w:eastAsia="Times New Roman"/>
-          <w:sz w:val="24"/>
-        </w:rPr>
-        <w:t xml:space="preserve"> attribute (Duflo et al., 2013), and that firms endogenously choose certifiers that have previously rated them favourably (Bar and Zheng, 2019). We do not have two measurements of the same attribute; we have two different attributes, measured by two different parties, inside a single document. The sign separation described above is the evidence this design can produce, and we show why a pure applicant-selection account cannot reproduce it on its own.</w:t>
+        <w:t>First</w:t>
+      </w:r>
+      <w:r>
+        <w:rPr>
+          <w:rFonts w:ascii="Times New Roman" w:hAnsi="Times New Roman" w:eastAsia="Times New Roman"/>
+          <w:sz w:val="24"/>
+        </w:rPr>
+        <w:t>, it builds an S&amp;T intelligence extraction pipeline over a previously unstructured administrative corpus and, from it, the first record-level trial-channel variable for China's variety approval system — a variable read directly from the wording of official approval announcements rather than imposed as a before/after period indicator. This turns "the 2016 reform" from a single time-varying treatment into an observable, record-level assignment that can be compared within year, trial group and check — the design that Xiang et al. (2025) and Zhao et al. (2022) could not implement without this variable. The same pipeline yields a 17-field indicator set in which each field is labelled by its measuring party, which is what makes the second contribution possible.</w:t>
       </w:r>
     </w:p>
     <w:p>
@@ -542,14 +504,14 @@
           <w:b/>
           <w:sz w:val="24"/>
         </w:rPr>
-        <w:t>Third</w:t>
-      </w:r>
-      <w:r>
-        <w:rPr>
-          <w:rFonts w:ascii="Times New Roman" w:hAnsi="Times New Roman" w:eastAsia="Times New Roman"/>
-          <w:sz w:val="24"/>
-        </w:rPr>
-        <w:t>, it splits the reform into two treatments that do not overlap in time and shows that pooling them manufactures an average that never occurred: the green channel (2017) and consortium trials (2019–2022) differ in sign on at least one trait (the applicant-measured production-trial yield gain), so estimating them jointly as a single "new channel" would misstate the direction of the underlying gap. Within this design, we use Anhui Winall Hi-Tech Seed Co. — the single largest beneficiary of rising national-approval share among integrated seed enterprises over this period, and a firm the green channel was in principle designed to serve — as a counter-case, not as a source of the main result: it uses the unified trial more, not less, than its peers, which rules out "self-organised entrants are simply weaker firms" as an alternative explanation for the quality gap. This role is deliberately narrow, and the main results do not depend on this firm's records.</w:t>
+        <w:t>Second</w:t>
+      </w:r>
+      <w:r>
+        <w:rPr>
+          <w:rFonts w:ascii="Times New Roman" w:hAnsi="Times New Roman" w:eastAsia="Times New Roman"/>
+          <w:sz w:val="24"/>
+        </w:rPr>
+        <w:t>, it turns the coexistence of applicant-measured and third-party-measured traits within the same approval file into an identification argument, rather than a description. We do not have two measurements of the same attribute, as the randomised self-certification literature does (Duflo et al., 2013; Bar and Zheng, 2019); we have two different attributes, measured by two different parties, inside a single document. That literature supplies the interpretation of the pattern we find — reported values reflect who was asked to measure — but not the paper's frame, which is the reliability structure of an official data source. The sign separation described above is the evidence this design can produce, and we show why a pure applicant-selection account cannot reproduce it on its own.</w:t>
       </w:r>
     </w:p>
     <w:p>
@@ -560,24 +522,17 @@
       <w:r>
         <w:rPr>
           <w:rFonts w:ascii="Times New Roman" w:hAnsi="Times New Roman" w:eastAsia="Times New Roman"/>
-          <w:sz w:val="24"/>
-        </w:rPr>
-        <w:t xml:space="preserve">This paper's approach — an institutional-economics reading of a Chinese crop-sector regulation, using approval-record text rather than a laboratory or field trial as its evidence base — sits alongside a strand of </w:t>
-      </w:r>
-      <w:r>
-        <w:rPr>
-          <w:rFonts w:ascii="Times New Roman" w:hAnsi="Times New Roman" w:eastAsia="Times New Roman"/>
-          <w:i/>
-          <w:sz w:val="24"/>
-        </w:rPr>
-        <w:t>Journal of Integrative Agriculture</w:t>
-      </w:r>
-      <w:r>
-        <w:rPr>
-          <w:rFonts w:ascii="Times New Roman" w:hAnsi="Times New Roman" w:eastAsia="Times New Roman"/>
-          <w:sz w:val="24"/>
-        </w:rPr>
-        <w:t xml:space="preserve"> scholarship on cognate topics: variety-improvement history and germplasm contribution (Shi and Hu, 2017), information asymmetry in farmers' seed-choice behaviour (Qiu et al., 2016), and contract-farming incentive design in Chinese agriculture (Huang et al., 2018). We situate the present paper alongside these three not because they share our method, but because they establish that JIA already publishes exactly this blend of institutional-economics-of-agriculture work on China's seed and farming sectors.</w:t>
+          <w:b/>
+          <w:sz w:val="24"/>
+        </w:rPr>
+        <w:t>Third</w:t>
+      </w:r>
+      <w:r>
+        <w:rPr>
+          <w:rFonts w:ascii="Times New Roman" w:hAnsi="Times New Roman" w:eastAsia="Times New Roman"/>
+          <w:sz w:val="24"/>
+        </w:rPr>
+        <w:t>, it splits the reform into two treatments that do not overlap in time and shows that pooling them manufactures an average that never occurred: the green channel (2017) and consortium trials (2019–2022) differ in sign on at least one trait (the applicant-measured production-trial yield gain), so estimating them jointly as a single "new channel" would misstate the direction of the underlying gap. Within this design, we use Anhui Winall Hi-Tech Seed Co. — the single largest beneficiary of rising national-approval share among integrated seed enterprises over this period, and a firm the green channel was in principle designed to serve — as a counter-case, not as a source of the main result: it uses the unified trial more, not less, than its peers, which rules out "self-organised entrants are simply weaker firms" as an alternative explanation for the quality gap. This role is deliberately narrow, and the main results do not depend on this firm's records.</w:t>
       </w:r>
     </w:p>
     <w:p>
@@ -590,7 +545,35 @@
           <w:rFonts w:ascii="Times New Roman" w:hAnsi="Times New Roman" w:eastAsia="Times New Roman"/>
           <w:sz w:val="24"/>
         </w:rPr>
-        <w:t>The remainder of the paper proceeds as follows. Section 2 describes the institutional path from the unified regional trial to the green channel and consortium trials, and the quality-testing regime under NY/T 593. Section 3 describes the data and the construction and validation of the channel variable. Section 4 sets out the empirical strategy and states formally what the paper does and does not claim. Sections 5 and 6 report the main results and their robustness. Section 7 examines Winall Hi-Tech as a counter-case. Section 8 discusses the paper's contribution to the literature on self-certification and its policy implications, and Section 9 concludes.</w:t>
+        <w:t xml:space="preserve">This paper's approach — a text-mining reading of a Chinese crop-sector regulatory corpus, using approval-record text rather than a laboratory or field trial as its evidence base — sits alongside a strand of </w:t>
+      </w:r>
+      <w:r>
+        <w:rPr>
+          <w:rFonts w:ascii="Times New Roman" w:hAnsi="Times New Roman" w:eastAsia="Times New Roman"/>
+          <w:i/>
+          <w:sz w:val="24"/>
+        </w:rPr>
+        <w:t>Journal of Integrative Agriculture</w:t>
+      </w:r>
+      <w:r>
+        <w:rPr>
+          <w:rFonts w:ascii="Times New Roman" w:hAnsi="Times New Roman" w:eastAsia="Times New Roman"/>
+          <w:sz w:val="24"/>
+        </w:rPr>
+        <w:t xml:space="preserve"> scholarship on cognate topics: variety-improvement history and germplasm contribution (Shi and Hu, 2017), information asymmetry in farmers' seed-choice behaviour (Qiu et al., 2016), and contract-farming incentive design in Chinese agriculture (Huang et al., 2018). We situate the present paper alongside these three not because they share our method, but because they establish that JIA already publishes exactly this blend of institutional-economics-of-agriculture work on China's seed and farming sectors.</w:t>
+      </w:r>
+    </w:p>
+    <w:p>
+      <w:pPr>
+        <w:spacing w:line="480" w:lineRule="auto" w:after="160"/>
+        <w:jc w:val="left"/>
+      </w:pPr>
+      <w:r>
+        <w:rPr>
+          <w:rFonts w:ascii="Times New Roman" w:hAnsi="Times New Roman" w:eastAsia="Times New Roman"/>
+          <w:sz w:val="24"/>
+        </w:rPr>
+        <w:t>The remainder of the paper proceeds as follows. Section 2 describes the institutional path from the unified regional trial to the green channel and consortium trials, and the quality-testing regime under NY/T 593. Section 3 describes the intelligence-extraction pipeline, the data it produces, and the construction and validation of the channel variable. Section 4 sets out the empirical strategy and states formally what the paper does and does not claim. Sections 5 and 6 report the main results and their robustness. Section 7 examines Winall Hi-Tech as a counter-case. Section 8 discusses the paper's implications for S&amp;T intelligence practice, its relation to the self-certification literature, and its policy implications; Section 9 concludes.</w:t>
       </w:r>
     </w:p>
     <w:p>
@@ -788,7 +771,110 @@
           <w:b/>
           <w:sz w:val="26"/>
         </w:rPr>
-        <w:t>3. Data</w:t>
+        <w:t>3. Data and the intelligence-extraction pipeline</w:t>
+      </w:r>
+    </w:p>
+    <w:p>
+      <w:pPr>
+        <w:spacing w:line="480" w:lineRule="auto" w:after="160"/>
+        <w:jc w:val="left"/>
+      </w:pPr>
+      <w:r>
+        <w:rPr>
+          <w:rFonts w:ascii="Times New Roman" w:hAnsi="Times New Roman" w:eastAsia="Times New Roman"/>
+          <w:sz w:val="24"/>
+        </w:rPr>
+        <w:t xml:space="preserve">Because the corpus underlying this paper is an unstructured administrative text collection rather than an existing dataset, the Data section doubles as a methods section for the extraction itself. We set it out as a six-step S&amp;T intelligence pipeline, and flag each step where it occurs below: (i) </w:t>
+      </w:r>
+      <w:r>
+        <w:rPr>
+          <w:rFonts w:ascii="Times New Roman" w:hAnsi="Times New Roman" w:eastAsia="Times New Roman"/>
+          <w:b/>
+          <w:sz w:val="24"/>
+        </w:rPr>
+        <w:t>intelligence-source identification</w:t>
+      </w:r>
+      <w:r>
+        <w:rPr>
+          <w:rFonts w:ascii="Times New Roman" w:hAnsi="Times New Roman" w:eastAsia="Times New Roman"/>
+          <w:sz w:val="24"/>
+        </w:rPr>
+        <w:t xml:space="preserve"> — recognising variety-approval announcements as a high-density, record-level innovation corpus, and the trial-channel statement inside them as an extractable element (§3.1); (ii) </w:t>
+      </w:r>
+      <w:r>
+        <w:rPr>
+          <w:rFonts w:ascii="Times New Roman" w:hAnsi="Times New Roman" w:eastAsia="Times New Roman"/>
+          <w:b/>
+          <w:sz w:val="24"/>
+        </w:rPr>
+        <w:t>corpus acquisition</w:t>
+      </w:r>
+      <w:r>
+        <w:rPr>
+          <w:rFonts w:ascii="Times New Roman" w:hAnsi="Times New Roman" w:eastAsia="Times New Roman"/>
+          <w:sz w:val="24"/>
+        </w:rPr>
+        <w:t xml:space="preserve"> — obtaining the announcement text and documenting its two-step provenance (§3.1); (iii) </w:t>
+      </w:r>
+      <w:r>
+        <w:rPr>
+          <w:rFonts w:ascii="Times New Roman" w:hAnsi="Times New Roman" w:eastAsia="Times New Roman"/>
+          <w:b/>
+          <w:sz w:val="24"/>
+        </w:rPr>
+        <w:t>field extraction</w:t>
+      </w:r>
+      <w:r>
+        <w:rPr>
+          <w:rFonts w:ascii="Times New Roman" w:hAnsi="Times New Roman" w:eastAsia="Times New Roman"/>
+          <w:sz w:val="24"/>
+        </w:rPr>
+        <w:t xml:space="preserve"> — a regular-expression rule set that converts each announcement's running prose into typed fields (§3.1); (iv) </w:t>
+      </w:r>
+      <w:r>
+        <w:rPr>
+          <w:rFonts w:ascii="Times New Roman" w:hAnsi="Times New Roman" w:eastAsia="Times New Roman"/>
+          <w:b/>
+          <w:sz w:val="24"/>
+        </w:rPr>
+        <w:t>entity recognition and disambiguation</w:t>
+      </w:r>
+      <w:r>
+        <w:rPr>
+          <w:rFonts w:ascii="Times New Roman" w:hAnsi="Times New Roman" w:eastAsia="Times New Roman"/>
+          <w:sz w:val="24"/>
+        </w:rPr>
+        <w:t xml:space="preserve"> — resolving applicant and variety identity across announcements that name the same actor inconsistently, with a reported precision and recall against a labelled subset (§3.1); (v) </w:t>
+      </w:r>
+      <w:r>
+        <w:rPr>
+          <w:rFonts w:ascii="Times New Roman" w:hAnsi="Times New Roman" w:eastAsia="Times New Roman"/>
+          <w:b/>
+          <w:sz w:val="24"/>
+        </w:rPr>
+        <w:t>field-coverage and data-quality assessment</w:t>
+      </w:r>
+      <w:r>
+        <w:rPr>
+          <w:rFonts w:ascii="Times New Roman" w:hAnsi="Times New Roman" w:eastAsia="Times New Roman"/>
+          <w:sz w:val="24"/>
+        </w:rPr>
+        <w:t xml:space="preserve"> — per-field parse rates, missingness by arm, structural gaps in the source, and the outstanding cross-check against the primary announcements (§3.3–§3.4); and (vi) </w:t>
+      </w:r>
+      <w:r>
+        <w:rPr>
+          <w:rFonts w:ascii="Times New Roman" w:hAnsi="Times New Roman" w:eastAsia="Times New Roman"/>
+          <w:b/>
+          <w:sz w:val="24"/>
+        </w:rPr>
+        <w:t>indicator construction</w:t>
+      </w:r>
+      <w:r>
+        <w:rPr>
+          <w:rFonts w:ascii="Times New Roman" w:hAnsi="Times New Roman" w:eastAsia="Times New Roman"/>
+          <w:sz w:val="24"/>
+        </w:rPr>
+        <w:t xml:space="preserve"> — assembling the parsed fields into the 17 analysis variables, each labelled by its measuring party, and defining the strata over which they are compared (§3.2–§3.3). Steps (i)–(iv) are what a reader wanting to reproduce the corpus needs; step (v) is what a reader wanting to judge how far to trust any individual field needs, and we report it at field level rather than as a single corpus-wide quality statement, for reasons the paper's main result makes concrete.</w:t>
       </w:r>
     </w:p>
     <w:p>
@@ -803,7 +889,7 @@
           <w:b/>
           <w:sz w:val="24"/>
         </w:rPr>
-        <w:t>3.1 Source and construction of the trial-channel variable</w:t>
+        <w:t>3.1 Intelligence source, corpus acquisition, field extraction and entity resolution (steps i–iv)</w:t>
       </w:r>
     </w:p>
     <w:p>
@@ -1000,6 +1086,19 @@
           <w:sz w:val="24"/>
         </w:rPr>
         <w:t>; the channel label itself is unrecoverable for 233 of 234 national records approved in 2018 (99.6%), which we treat as a documentation-format gap for that year rather than as evidence that self-organised trials did not exist in 2018 (see the year-by-year channel count by channel, Fig. 1 and Table 1, and robustness check R4 in §6, which shows the 2018 coding choice is immaterial to the main estimates).</w:t>
+      </w:r>
+    </w:p>
+    <w:p>
+      <w:pPr>
+        <w:spacing w:line="480" w:lineRule="auto" w:after="160"/>
+        <w:jc w:val="left"/>
+      </w:pPr>
+      <w:r>
+        <w:rPr>
+          <w:rFonts w:ascii="Times New Roman" w:hAnsi="Times New Roman" w:eastAsia="Times New Roman"/>
+          <w:sz w:val="24"/>
+        </w:rPr>
+        <w:t>Step (iv) of the pipeline, entity recognition and disambiguation, is needed because the announcements do not carry a stable applicant identifier: the same breeding programme appears under varying institutional names, and for four approval years the applicant field is absent altogether (§3.3). For the one firm used as a counter-case in §7 we therefore identify firm-linked records by a pedigree-and-naming rule rather than by the applicant string — a record is coded firm-linked if the variety name begins with the firm's characteristic name element, or either parent line carries that element or the firm's line-code prefix. Validated against the 1,426 records that do carry an institutional label, the rule attains a precision of 1.000 and a recall of 0.770; because unrecalled records fall into the comparison group rather than the treated group, every firm-versus-others contrast in §7 is biased toward zero, which is the conservative direction for the use we make of it. We report the rule and its error profile here rather than in §7 because it is a property of the corpus construction, not of the counter-case analysis, and because an entity-resolution rule whose recall is not stated is not auditable by anyone re-using the pipeline.</w:t>
       </w:r>
     </w:p>
     <w:p>
@@ -1014,7 +1113,7 @@
           <w:b/>
           <w:sz w:val="24"/>
         </w:rPr>
-        <w:t>3.2 Sample and stratification</w:t>
+        <w:t>3.2 Sample, stratification and indicator construction (step vi)</w:t>
       </w:r>
     </w:p>
     <w:p>
@@ -1087,7 +1186,7 @@
           <w:b/>
           <w:sz w:val="24"/>
         </w:rPr>
-        <w:t>3.3 Outcome variables, measuring party, and missingness</w:t>
+        <w:t>3.3 Outcome variables, measuring party, and field-level data quality (steps v–vi)</w:t>
       </w:r>
     </w:p>
     <w:p>
@@ -1100,7 +1199,37 @@
           <w:rFonts w:ascii="Times New Roman" w:hAnsi="Times New Roman" w:eastAsia="Times New Roman"/>
           <w:sz w:val="24"/>
         </w:rPr>
-        <w:t xml:space="preserve">The paper's identification argument turns on a distinction the announcements make explicit: some fields report performance as measured by a ministry-designated third-party assay body, and others report performance as measured and submitted by the applicant's own trial. The main quality outcomes — head-rice percentage (processing quality), chalkiness degree (appearance quality), and whether the announcement states a national or industry grain-quality grade — are all assayed by MARA-designated third-party grain-quality laboratories under the national testing standard NY/T 593; two disease-resistance outcomes (neck-blast tolerance grade and bacterial-blight grade) are likewise assessed by ministry-designated resistance-screening units. By contrast, the yield outcomes (two-year regional-trial yield gain over the named check, production-trial yield gain, and absolute regional-trial yield) and most agronomic outcomes (growth duration, plant height, seed-set percentage, thousand-grain weight, grains per panicle) are recorded from the applicant's own trial. </w:t>
+        <w:t xml:space="preserve">The single most consequential step in the pipeline is the one that attaches a </w:t>
+      </w:r>
+      <w:r>
+        <w:rPr>
+          <w:rFonts w:ascii="Times New Roman" w:hAnsi="Times New Roman" w:eastAsia="Times New Roman"/>
+          <w:b/>
+          <w:sz w:val="24"/>
+        </w:rPr>
+        <w:t>measuring party</w:t>
+      </w:r>
+      <w:r>
+        <w:rPr>
+          <w:rFonts w:ascii="Times New Roman" w:hAnsi="Times New Roman" w:eastAsia="Times New Roman"/>
+          <w:sz w:val="24"/>
+        </w:rPr>
+        <w:t xml:space="preserve"> to each extracted field. A conventional data-quality assessment asks how complete and how accurately transcribed a source is; here we additionally ask, field by field, </w:t>
+      </w:r>
+      <w:r>
+        <w:rPr>
+          <w:rFonts w:ascii="Times New Roman" w:hAnsi="Times New Roman" w:eastAsia="Times New Roman"/>
+          <w:i/>
+          <w:sz w:val="24"/>
+        </w:rPr>
+        <w:t>who generated the number the source reports</w:t>
+      </w:r>
+      <w:r>
+        <w:rPr>
+          <w:rFonts w:ascii="Times New Roman" w:hAnsi="Times New Roman" w:eastAsia="Times New Roman"/>
+          <w:sz w:val="24"/>
+        </w:rPr>
+        <w:t xml:space="preserve">, and treat that as a dimension of field reliability on a par with coverage. The paper's identification argument turns on a distinction the announcements make explicit: some fields report performance as measured by a ministry-designated third-party assay body, and others report performance as measured and submitted by the applicant's own trial. The main quality outcomes — head-rice percentage (processing quality), chalkiness degree (appearance quality), and whether the announcement states a national or industry grain-quality grade — are all assayed by MARA-designated third-party grain-quality laboratories under the national testing standard NY/T 593; two disease-resistance outcomes (neck-blast tolerance grade and bacterial-blight grade) are likewise assessed by ministry-designated resistance-screening units. By contrast, the yield outcomes (two-year regional-trial yield gain over the named check, production-trial yield gain, and absolute regional-trial yield) and most agronomic outcomes (growth duration, plant height, seed-set percentage, thousand-grain weight, grains per panicle) are recorded from the applicant's own trial. </w:t>
       </w:r>
       <w:r>
         <w:rPr>
@@ -1212,7 +1341,7 @@
           <w:b/>
           <w:sz w:val="24"/>
         </w:rPr>
-        <w:t>3.4 Representativeness and verification</w:t>
+        <w:t>3.4 Representativeness and source verification (step v)</w:t>
       </w:r>
     </w:p>
     <w:p>
@@ -1225,7 +1354,7 @@
           <w:rFonts w:ascii="Times New Roman" w:hAnsi="Times New Roman" w:eastAsia="Times New Roman"/>
           <w:sz w:val="24"/>
         </w:rPr>
-        <w:t xml:space="preserve">Two representativeness concerns bear directly on how the results should be read. First, the underlying compilation is a sample of announcements rather than a verified census, with declining coverage after 2022 (§3.1); we therefore restrict the analysis window to 2017–2022 and treat the post-2022 period only as background evidence that the channel distinction is currently being narrowed by regulatory action (see §4.4). Second, because the compilation is a third-party re-transcription of official text rather than the official record itself, transcription and parsing error are a live concern for any single field. Cross-checking the parsed corpus against the original MARA announcement text for a stratified random sample of records — the step needed to report a field-by-field agreement rate in this Methods section — requires reading the primary announcements directly, which the present analysis environment could not reach (see </w:t>
+        <w:t xml:space="preserve">Two representativeness concerns bear directly on how the results should be read. First, the underlying compilation is a sample of announcements rather than a verified census, with declining coverage after 2022 (§3.1); we therefore restrict the analysis window to 2017–2022 and treat the post-2022 period only as background evidence that the channel distinction is currently being narrowed by regulatory action (see §4.4). Second, because the compilation is a third-party re-transcription of official text rather than the official record itself, transcription and parsing error are a live concern for any single field. This is not a peculiarity of our source: large-scale audits of the databases on which S&amp;T indicators are routinely built find systematic, non-negligible error rates in them as well (Franceschini et al., 2016), and the appropriate response is to state the verification status of a corpus rather than to assume it. Cross-checking the parsed corpus against the original MARA announcement text for a stratified random sample of records — the step needed to report a field-by-field agreement rate in this Methods section — requires reading the primary announcements directly, which the present analysis environment could not reach (see </w:t>
       </w:r>
       <w:r>
         <w:rPr>
@@ -3640,7 +3769,7 @@
           <w:rFonts w:ascii="Times New Roman" w:hAnsi="Times New Roman" w:eastAsia="Times New Roman"/>
           <w:sz w:val="24"/>
         </w:rPr>
-        <w:t>It is not. Restricting to national approvals in 2017 and 2019–2022, Winall-linked records (n = 166) used the unified channel 60.2% of the time, against 47.5% for all other applicants (n = 1,101) (Table 5; Fig. 6a). A logit for channel choice, conditioning on year×trial-group fixed effects, confirms this is not an artefact of when or where Winall applied: being Winall-linked is associated with roughly half the odds of entering through a new channel (α = −0.728, SE = 0.182, p &lt; 0.0001, odds ratio 0.483; robust in magnitude and sign, though somewhat attenuated, under a no-fixed-effects specification and a two-major-trial-group-only sample). Within the unified channel, Winall's own entrants also outperform other unified entrants on the same third-party-assayed traits that define the main result: head-rice percentage +2.212 points, probability of a stated quality grade +9.8 points, chalkiness −0.692 points (all p &lt; 0.001) (Table 5; Fig. 6b). This within-channel advantage is not a general Winall effect, however: repeating the same comparison inside the new-channel subsample, all three coefficients lose significance (p &gt; 0.18 throughout), and the point estimates move toward zero or reverse sign (Fig. 6b). A firm that were simply better at breeding across the board should retain some of this edge wherever its varieties enter; Winall's edge is specific to the channel in which quality is measured by the same third party as everyone else.</w:t>
+        <w:t>It is not. Restricting to national approvals in 2017 and 2019–2022, Winall-linked records (n = 166; identified by the pedigree-and-naming entity-resolution rule described in §3.1, whose 0.770 recall biases every comparison below toward zero) used the unified channel 60.2% of the time, against 47.5% for all other applicants (n = 1,101) (Table 5; Fig. 6a). A logit for channel choice, conditioning on year×trial-group fixed effects, confirms this is not an artefact of when or where Winall applied: being Winall-linked is associated with roughly half the odds of entering through a new channel (α = −0.728, SE = 0.182, p &lt; 0.0001, odds ratio 0.483; robust in magnitude and sign, though somewhat attenuated, under a no-fixed-effects specification and a two-major-trial-group-only sample). Within the unified channel, Winall's own entrants also outperform other unified entrants on the same third-party-assayed traits that define the main result: head-rice percentage +2.212 points, probability of a stated quality grade +9.8 points, chalkiness −0.692 points (all p &lt; 0.001) (Table 5; Fig. 6b). This within-channel advantage is not a general Winall effect, however: repeating the same comparison inside the new-channel subsample, all three coefficients lose significance (p &gt; 0.18 throughout), and the point estimates move toward zero or reverse sign (Fig. 6b). A firm that were simply better at breeding across the board should retain some of this edge wherever its varieties enter; Winall's edge is specific to the channel in which quality is measured by the same third party as everyone else.</w:t>
       </w:r>
     </w:p>
     <w:p>
@@ -3738,7 +3867,7 @@
           <w:b/>
           <w:sz w:val="24"/>
         </w:rPr>
-        <w:t>8.1 Contribution to the self-certification literature</w:t>
+        <w:t>8.1 Why the sign separation arises: self-certification as theoretical support</w:t>
       </w:r>
     </w:p>
     <w:p>
@@ -3751,7 +3880,7 @@
           <w:rFonts w:ascii="Times New Roman" w:hAnsi="Times New Roman" w:eastAsia="Times New Roman"/>
           <w:sz w:val="24"/>
         </w:rPr>
-        <w:t xml:space="preserve">Duflo et al. (2013) randomly assigned polluting Indian plants to regulator-paid versus plant-paid auditors and observed the </w:t>
+        <w:t xml:space="preserve">The regulatory-economics literature on self-certification is not this paper's frame, but it supplies the mechanism that makes the observed sign separation intelligible, and we draw on it in that narrower role. Duflo et al. (2013) randomly assigned polluting Indian plants to regulator-paid versus plant-paid auditors and observed the </w:t>
       </w:r>
       <w:r>
         <w:rPr>
@@ -3766,7 +3895,7 @@
           <w:rFonts w:ascii="Times New Roman" w:hAnsi="Times New Roman" w:eastAsia="Times New Roman"/>
           <w:sz w:val="24"/>
         </w:rPr>
-        <w:t xml:space="preserve"> pollution readings diverge systematically — a randomised, same-attribute design this paper cannot match. We observe no randomisation of channel assignment and have no same-attribute comparison; we instead have two </w:t>
+        <w:t xml:space="preserve"> pollution readings diverge systematically; Bar and Zheng (2019) show that firms endogenously choose certifiers with a history of lenient grading — the closest existing analogue to the "channel self-selection" alternative this paper cannot close off (§4; R9/R11). Grennan and Town (2020) compare medical-device outcomes </w:t>
       </w:r>
       <w:r>
         <w:rPr>
@@ -3774,40 +3903,14 @@
           <w:i/>
           <w:sz w:val="24"/>
         </w:rPr>
-        <w:t>different</w:t>
-      </w:r>
-      <w:r>
-        <w:rPr>
-          <w:rFonts w:ascii="Times New Roman" w:hAnsi="Times New Roman" w:eastAsia="Times New Roman"/>
-          <w:sz w:val="24"/>
-        </w:rPr>
-        <w:t xml:space="preserve"> attributes, third-party-assayed grain quality and applicant-measured agronomic performance, coexisting in the same approval file. This is a weaker design for the same underlying question — does control over measurement shape what gets reported — but it offers scale and duration a bespoke audit experiment cannot: every one of 2,386 national approval records over six years carries this same self-organised/third-party split.</w:t>
-      </w:r>
-    </w:p>
-    <w:p>
-      <w:pPr>
-        <w:spacing w:line="480" w:lineRule="auto" w:after="160"/>
-        <w:jc w:val="left"/>
-      </w:pPr>
-      <w:r>
-        <w:rPr>
-          <w:rFonts w:ascii="Times New Roman" w:hAnsi="Times New Roman" w:eastAsia="Times New Roman"/>
-          <w:sz w:val="24"/>
-        </w:rPr>
-        <w:t>Bar and Zheng (2019) show that firms endogenously choose certifiers on the basis of geographic proximity and a certifier's history of lenient grading — a self-selection channel our design cannot close off, and the closest existing analogue to the "channel self-selection" alternative flagged throughout this paper (§4; R9/R11), which our within-applicant test lacks the power to rule out. Qiu et al. (2016) offer the theoretical framework closest to this paper's own "who measures what" question, from the demand side: Chinese maize farmers' seed choices are shaped by asymmetric information between sellers and buyers, who rely on imperfect quality signals because they cannot observe quality directly. Our paper documents an analogous asymmetry one stage upstream, at variety approval rather than farmer purchase — the two papers describe the same information problem recurring at different links of the same seed-supply chain.</w:t>
-      </w:r>
-    </w:p>
-    <w:p>
-      <w:pPr>
-        <w:spacing w:line="480" w:lineRule="auto" w:after="160"/>
-        <w:jc w:val="left"/>
-      </w:pPr>
-      <w:r>
-        <w:rPr>
-          <w:rFonts w:ascii="Times New Roman" w:hAnsi="Times New Roman" w:eastAsia="Times New Roman"/>
-          <w:sz w:val="24"/>
-        </w:rPr>
-        <w:t xml:space="preserve">Grennan and Town (2020) compare medical-device outcomes </w:t>
+        <w:t>across</w:t>
+      </w:r>
+      <w:r>
+        <w:rPr>
+          <w:rFonts w:ascii="Times New Roman" w:hAnsi="Times New Roman" w:eastAsia="Times New Roman"/>
+          <w:sz w:val="24"/>
+        </w:rPr>
+        <w:t xml:space="preserve"> two regulatory systems, where ours is a comparison </w:t>
       </w:r>
       <w:r>
         <w:rPr>
@@ -3815,21 +3918,6 @@
           <w:i/>
           <w:sz w:val="24"/>
         </w:rPr>
-        <w:t>across</w:t>
-      </w:r>
-      <w:r>
-        <w:rPr>
-          <w:rFonts w:ascii="Times New Roman" w:hAnsi="Times New Roman" w:eastAsia="Times New Roman"/>
-          <w:sz w:val="24"/>
-        </w:rPr>
-        <w:t xml:space="preserve"> two regulatory systems (EU, US); our comparison is </w:t>
-      </w:r>
-      <w:r>
-        <w:rPr>
-          <w:rFonts w:ascii="Times New Roman" w:hAnsi="Times New Roman" w:eastAsia="Times New Roman"/>
-          <w:i/>
-          <w:sz w:val="24"/>
-        </w:rPr>
         <w:t>within</w:t>
       </w:r>
       <w:r>
@@ -3837,7 +3925,7 @@
           <w:rFonts w:ascii="Times New Roman" w:hAnsi="Times New Roman" w:eastAsia="Times New Roman"/>
           <w:sz w:val="24"/>
         </w:rPr>
-        <w:t xml:space="preserve"> one system, across two trial pathways a single reform created side by side — narrower but more tightly controlled, since year, ecology and check are held fixed by construction. Renckens and Auld (2022) show private regulatory audits vary in efficiency with auditor incentives and monitoring intensity, a mechanism consistent with, though not directly tested by, our finding that the identification argument rests on where the third party sits relative to the applicant, not on auditor effort per se.</w:t>
+        <w:t xml:space="preserve"> one system across two pathways a single reform created side by side, and Renckens and Auld (2022) show private regulatory audits vary in efficiency with auditor incentives and monitoring intensity. Taken together these results establish that reported values move with who was asked to measure — which is exactly the interpretation the sign separation invites, and which is why we report it as consistent with measurement discretion rather than proof of it: none of these designs is available here, since we observe two different attributes measured by two parties rather than one attribute measured twice. Qiu et al. (2016) describe the same information problem one stage downstream, where Chinese farmers must infer unobservable seed quality from imperfect signals; our result places an analogous asymmetry inside the approval file itself.</w:t>
       </w:r>
     </w:p>
     <w:p>
@@ -3921,7 +4009,7 @@
           <w:b/>
           <w:sz w:val="24"/>
         </w:rPr>
-        <w:t>8.4 Limitations</w:t>
+        <w:t>8.4 Implications for S&amp;T intelligence practice</w:t>
       </w:r>
     </w:p>
     <w:p>
@@ -3934,21 +4022,91 @@
           <w:rFonts w:ascii="Times New Roman" w:hAnsi="Times New Roman" w:eastAsia="Times New Roman"/>
           <w:sz w:val="24"/>
         </w:rPr>
-        <w:t xml:space="preserve">Five limitations bound this paper's scope. The evidence covers a single country and a single crop (rice); whether the same channel-measurement asymmetry appears in other crops or seed-regulation regimes is untested here. Channel self-selection cannot be fully separated from measurement discretion with the data at hand — the within-applicant comparison in Section 6 is directionally uninformative because it is underpowered, not because it rules out self-selection. The </w:t>
-      </w:r>
-      <w:r>
-        <w:rPr>
-          <w:rFonts w:ascii="Times New Roman" w:hAnsi="Times New Roman" w:eastAsia="Times New Roman"/>
-          <w:sz w:val="24"/>
-        </w:rPr>
-        <w:t>applicant_type</w:t>
-      </w:r>
-      <w:r>
-        <w:rPr>
-          <w:rFonts w:ascii="Times New Roman" w:hAnsi="Times New Roman" w:eastAsia="Times New Roman"/>
-          <w:sz w:val="24"/>
-        </w:rPr>
-        <w:t xml:space="preserve"> field needed for the enterprise-versus-institute comparison in Section 7 is entirely missing for the 2016, 2017, 2018 and 2021 approval cohorts, which limits that comparison to years with non-missing labels and to the two major trial groups. The underlying announcement compilation is not an official, complete registry of all approvals; it is a secondary compilation of Ministry announcements, and its completeness was checked against a 50-record manual audit rather than assumed. Finally, the analysis window runs through 2022 because compiled announcement coverage falls sharply afterward; this paper accordingly cannot speak to whether the convergence trends documented in Section 8.2, or the divergent trend in head-rice percentage, continue, reverse, or stabilise after 2022.</w:t>
+        <w:t>Read as an intelligence exercise rather than an agricultural one, this paper makes four points that generalise beyond rice.</w:t>
+      </w:r>
+    </w:p>
+    <w:p>
+      <w:pPr>
+        <w:spacing w:line="480" w:lineRule="auto" w:after="160"/>
+        <w:jc w:val="left"/>
+      </w:pPr>
+      <w:r>
+        <w:rPr>
+          <w:rFonts w:ascii="Times New Roman" w:hAnsi="Times New Roman" w:eastAsia="Times New Roman"/>
+          <w:b/>
+          <w:sz w:val="24"/>
+        </w:rPr>
+        <w:t>Administrative approval corpora are a usable, unusually rich innovation data source — within limits.</w:t>
+      </w:r>
+      <w:r>
+        <w:rPr>
+          <w:rFonts w:ascii="Times New Roman" w:hAnsi="Times New Roman" w:eastAsia="Times New Roman"/>
+          <w:sz w:val="24"/>
+        </w:rPr>
+        <w:t xml:space="preserve"> Innovation measurement has broadened from patents and publications to trademarks, web traces and transaction data (Rammer and Es-Sadki, 2023), but the records a state generates when it authorises a technology for market have stayed outside the indicator toolkit, chiefly because they are published as prose. They repay parsing: one announcement yields the applicant, the testing arrangement, the comparison baseline and more than a dozen measured performance fields, tied to an actual market-entry decision rather than to an application. The limits were equally concrete here — an unverified third-party re-transcription (§3.4), coverage collapsing after 2022 (§4.7, Non-claim 7), and an applicant field absent for four years (§3.1) — so an analyst adopting this class of source should expect most of the effort to fall on pipeline steps (iv) and (v), not on extraction.</w:t>
+      </w:r>
+    </w:p>
+    <w:p>
+      <w:pPr>
+        <w:spacing w:line="480" w:lineRule="auto" w:after="160"/>
+        <w:jc w:val="left"/>
+      </w:pPr>
+      <w:r>
+        <w:rPr>
+          <w:rFonts w:ascii="Times New Roman" w:hAnsi="Times New Roman" w:eastAsia="Times New Roman"/>
+          <w:b/>
+          <w:sz w:val="24"/>
+        </w:rPr>
+        <w:t>Reliability is a property of fields, not of sources.</w:t>
+      </w:r>
+      <w:r>
+        <w:rPr>
+          <w:rFonts w:ascii="Times New Roman" w:hAnsi="Times New Roman" w:eastAsia="Times New Roman"/>
+          <w:sz w:val="24"/>
+        </w:rPr>
+        <w:t xml:space="preserve"> Within one official document, issued by one authority on one date, fields differed in evidential strength, and what predicted the difference was who measured: the laboratory-assayed quality traits moved one way, the applicant-recorded yield gain the other. Standard data-quality assessment in scientometrics and technology analysis is source-level — coverage, error rates, duplication, classification accuracy (Franceschini et al., 2016; Jaffe and de Rassenfosse, 2017) — and a source that passes such an audit can still contain fields of very different evidential value. Provenance labelling should therefore be a required step when building indicators from approval corpora: tag each field with its measuring party and stratify the reliability assessment by that tag, rather than issuing one verdict for the source.</w:t>
+      </w:r>
+    </w:p>
+    <w:p>
+      <w:pPr>
+        <w:spacing w:line="480" w:lineRule="auto" w:after="160"/>
+        <w:jc w:val="left"/>
+      </w:pPr>
+      <w:r>
+        <w:rPr>
+          <w:rFonts w:ascii="Times New Roman" w:hAnsi="Times New Roman" w:eastAsia="Times New Roman"/>
+          <w:b/>
+          <w:sz w:val="24"/>
+        </w:rPr>
+        <w:t>The diagnostic is portable.</w:t>
+      </w:r>
+      <w:r>
+        <w:rPr>
+          <w:rFonts w:ascii="Times New Roman" w:hAnsi="Times New Roman" w:eastAsia="Times New Roman"/>
+          <w:sz w:val="24"/>
+        </w:rPr>
+        <w:t xml:space="preserve"> The structural feature exploited here — applicant-supplied dossier material and independent assay results bound into one official record — is not specific to seed regulation. It recurs in drug approval, where sponsor-run trial results and regulator-reviewed labelling coexist in documents already mined at scale (Shi et al., 2021); in medical-device registration; and in patent examination, where applicant-drafted claims sit alongside examiner-added citations, a distinction the patent-indicator literature adopted only after treating all citations alike produced biased measures (Jaffe and de Rassenfosse, 2017). The test is the same and cheap in each case: partition fields by measuring party and check whether the contrast of interest holds the same sign in both partitions. A contrast confined to the self-supplied partition is a candidate reporting artefact; one present in both is more likely real.</w:t>
+      </w:r>
+    </w:p>
+    <w:p>
+      <w:pPr>
+        <w:spacing w:line="480" w:lineRule="auto" w:after="160"/>
+        <w:jc w:val="left"/>
+      </w:pPr>
+      <w:r>
+        <w:rPr>
+          <w:rFonts w:ascii="Times New Roman" w:hAnsi="Times New Roman" w:eastAsia="Times New Roman"/>
+          <w:b/>
+          <w:sz w:val="24"/>
+        </w:rPr>
+        <w:t>For technology assessment and competitive intelligence specifically.</w:t>
+      </w:r>
+      <w:r>
+        <w:rPr>
+          <w:rFonts w:ascii="Times New Roman" w:hAnsi="Times New Roman" w:eastAsia="Times New Roman"/>
+          <w:sz w:val="24"/>
+        </w:rPr>
+        <w:t xml:space="preserve"> Text mining of S&amp;T corpora was developed to support research management and technology watch (Losiewicz et al., 2000; Antons et al., 2020); approval records extend that practice to the point where a technology reaches users. The indicators built here answer the questions such work asks — which actors produce approved varieties, by which testing route, at what measured quality — while the provenance labels tell the analyst which of those indicators will bear weight. The recommendation for the corpus publisher is correspondingly cheap: the channel already exists inside every announcement, and issuing it as a field would let downstream users condition on it directly (§8.3).</w:t>
       </w:r>
     </w:p>
     <w:p>
@@ -3961,9 +4119,9 @@
         <w:rPr>
           <w:rFonts w:ascii="Times New Roman" w:hAnsi="Times New Roman" w:eastAsia="Times New Roman"/>
           <w:b/>
-          <w:sz w:val="26"/>
-        </w:rPr>
-        <w:t>9. Conclusion</w:t>
+          <w:sz w:val="24"/>
+        </w:rPr>
+        <w:t>8.5 Limitations</w:t>
       </w:r>
     </w:p>
     <w:p>
@@ -3976,20 +4134,21 @@
           <w:rFonts w:ascii="Times New Roman" w:hAnsi="Times New Roman" w:eastAsia="Times New Roman"/>
           <w:sz w:val="24"/>
         </w:rPr>
-        <w:t>China's 2016 reform of variety approval did not just change how many rice varieties reach the market through self-organised trials; by parsing which trial each variety actually passed through, we show it changed what those varieties look like on the traits that a third party, rather than the applicant, measures — worse third-party-assayed grain-processing and appearance quality among self-organised entrants, alongside applicant-measured performance that is unchanged or higher, a sign separation that a simple breeding-ability story cannot produce and that survives dropping the single largest beneficiary firm from the sample.</w:t>
-      </w:r>
-    </w:p>
-    <w:p>
-      <w:pPr>
-        <w:spacing w:line="480" w:lineRule="auto" w:after="160"/>
-        <w:jc w:val="left"/>
-      </w:pPr>
-      <w:r>
-        <w:rPr>
-          <w:rFonts w:ascii="Times New Roman" w:hAnsi="Times New Roman" w:eastAsia="Times New Roman"/>
-          <w:sz w:val="24"/>
-        </w:rPr>
-        <w:t>This finding is a composition effect on the population of varieties entering under each trial pathway, not a causal effect of channel assignment on any individual variety, and should not be read more broadly. It does not speak to farmer welfare, extension outcomes, or seed prices; it does not allege fabrication or manipulation of any applicant's trial results, a possibility the data cannot distinguish from channel self-selection or differing admission thresholds; and it does not extend to every third-party-measured trait or every level of government, since disease-resistance grading moves the other way and the provincial replication is conclusive for only one of four outcomes. Within these bounds, the contribution is narrow: a record-level channel variable, built from the text of approval announcements rather than a before/after indicator, that lets who measures what be observed directly — and shows that this, not only the volume of entrants, changed after 2016.</w:t>
+        <w:t xml:space="preserve">Five limitations bound this paper's scope. The evidence covers a single country and a single crop (rice); whether the same channel-measurement asymmetry appears in other crops or seed-regulation regimes is untested here. Channel self-selection cannot be fully separated from measurement discretion with the data at hand — the within-applicant comparison in Section 6 is directionally uninformative because it is underpowered, not because it rules out self-selection. The </w:t>
+      </w:r>
+      <w:r>
+        <w:rPr>
+          <w:rFonts w:ascii="Times New Roman" w:hAnsi="Times New Roman" w:eastAsia="Times New Roman"/>
+          <w:sz w:val="24"/>
+        </w:rPr>
+        <w:t>applicant_type</w:t>
+      </w:r>
+      <w:r>
+        <w:rPr>
+          <w:rFonts w:ascii="Times New Roman" w:hAnsi="Times New Roman" w:eastAsia="Times New Roman"/>
+          <w:sz w:val="24"/>
+        </w:rPr>
+        <w:t xml:space="preserve"> field needed for the enterprise-versus-institute comparison in Section 7 is entirely missing for the 2016, 2017, 2018 and 2021 approval cohorts, which limits that comparison to years with non-missing labels and to the two major trial groups. The underlying announcement compilation is not an official, complete registry of all approvals; it is a secondary compilation of Ministry announcements, and its completeness was checked against a 50-record manual audit rather than assumed. Finally, the analysis window runs through 2022 because compiled announcement coverage falls sharply afterward; this paper accordingly cannot speak to whether the convergence trends documented in Section 8.2, or the divergent trend in head-rice percentage, continue, reverse, or stabilise after 2022.</w:t>
       </w:r>
     </w:p>
     <w:p>
@@ -4002,9 +4161,9 @@
         <w:rPr>
           <w:rFonts w:ascii="Times New Roman" w:hAnsi="Times New Roman" w:eastAsia="Times New Roman"/>
           <w:b/>
-          <w:sz w:val="24"/>
-        </w:rPr>
-        <w:t>Acknowledgements</w:t>
+          <w:sz w:val="26"/>
+        </w:rPr>
+        <w:t>9. Conclusion</w:t>
       </w:r>
     </w:p>
     <w:p>
@@ -4017,7 +4176,20 @@
           <w:rFonts w:ascii="Times New Roman" w:hAnsi="Times New Roman" w:eastAsia="Times New Roman"/>
           <w:sz w:val="24"/>
         </w:rPr>
-        <w:t>[Author to complete: funding sources, reviewer thanks, etc.]</w:t>
+        <w:t>China's 2016 reform of variety approval did not just change how many rice varieties reach the market through self-organised trials; by parsing which trial each variety actually passed through, we show it changed what those varieties look like on the traits that a third party, rather than the applicant, measures — worse third-party-assayed grain-processing and appearance quality among self-organised entrants, alongside applicant-measured performance that is unchanged or higher, a sign separation that a simple breeding-ability story cannot produce and that survives dropping the single largest beneficiary firm from the sample.</w:t>
+      </w:r>
+    </w:p>
+    <w:p>
+      <w:pPr>
+        <w:spacing w:line="480" w:lineRule="auto" w:after="160"/>
+        <w:jc w:val="left"/>
+      </w:pPr>
+      <w:r>
+        <w:rPr>
+          <w:rFonts w:ascii="Times New Roman" w:hAnsi="Times New Roman" w:eastAsia="Times New Roman"/>
+          <w:sz w:val="24"/>
+        </w:rPr>
+        <w:t>This finding is a composition effect on the population of varieties entering under each trial pathway, not a causal effect of channel assignment on any individual variety, and should not be read more broadly. It does not speak to farmer welfare, extension outcomes, or seed prices; it does not allege fabrication or manipulation of any applicant's trial results, a possibility the data cannot distinguish from channel self-selection or differing admission thresholds; and it does not extend to every third-party-measured trait or every level of government, since disease-resistance grading moves the other way and the provincial replication is conclusive for only one of four outcomes. Within these bounds, the contribution is narrow but has two faces. As agricultural technology assessment, it supplies a record-level channel variable, built from the text of approval announcements rather than a before/after indicator, that lets who measures what be observed directly — and shows that this, not only the volume of entrants, changed after 2016. As S&amp;T intelligence, it demonstrates that a long-public administrative corpus can be converted into a structured indicator system, and that the resulting indicators must be read field by field: inside a single official source, the strength of the evidence depended on who did the measuring. That diagnostic is the part of this paper most likely to be useful outside rice, and it can be applied wherever self-supplied dossier material and independent assay results are bound into the same approval record.</w:t>
       </w:r>
     </w:p>
     <w:p>
@@ -4032,7 +4204,7 @@
           <w:b/>
           <w:sz w:val="24"/>
         </w:rPr>
-        <w:t>Conflict of interest</w:t>
+        <w:t>Acknowledgements</w:t>
       </w:r>
     </w:p>
     <w:p>
@@ -4045,7 +4217,7 @@
           <w:rFonts w:ascii="Times New Roman" w:hAnsi="Times New Roman" w:eastAsia="Times New Roman"/>
           <w:sz w:val="24"/>
         </w:rPr>
-        <w:t>The authors declare no conflict of interest.</w:t>
+        <w:t>[Author to complete: funding sources, reviewer thanks, etc.]</w:t>
       </w:r>
     </w:p>
     <w:p>
@@ -4060,7 +4232,7 @@
           <w:b/>
           <w:sz w:val="24"/>
         </w:rPr>
-        <w:t>Data availability statement</w:t>
+        <w:t>Conflict of interest</w:t>
       </w:r>
     </w:p>
     <w:p>
@@ -4073,7 +4245,7 @@
           <w:rFonts w:ascii="Times New Roman" w:hAnsi="Times New Roman" w:eastAsia="Times New Roman"/>
           <w:sz w:val="24"/>
         </w:rPr>
-        <w:t>The variety-approval text corpus underlying this study was compiled from publicly available Ministry of Agriculture and Rural Affairs announcements via a third-party aggregation (see Methods). Parsing scripts, the field dictionary, and the list of approval-record identifiers used in the analysis are available at [repository link]. Due to the unresolved licensing status of the upstream aggregation, the full parsed dataset is not redistributed; researchers can reconstruct it from the cited public announcements using the provided scripts.</w:t>
+        <w:t>The authors declare no conflict of interest.</w:t>
       </w:r>
     </w:p>
     <w:p>
@@ -4088,7 +4260,7 @@
           <w:b/>
           <w:sz w:val="24"/>
         </w:rPr>
-        <w:t>CRediT author contributions</w:t>
+        <w:t>Data availability statement</w:t>
       </w:r>
     </w:p>
     <w:p>
@@ -4099,199 +4271,9 @@
       <w:r>
         <w:rPr>
           <w:rFonts w:ascii="Times New Roman" w:hAnsi="Times New Roman" w:eastAsia="Times New Roman"/>
-          <w:i/>
-          <w:sz w:val="24"/>
-        </w:rPr>
-        <w:t>(Placeholder — to be completed by the author team before submission. List each named author against the CRediT roles that apply; a role may be shared by more than one author.)</w:t>
-      </w:r>
-    </w:p>
-    <w:p>
-      <w:pPr>
-        <w:pStyle w:val="ListBullet"/>
-        <w:spacing w:line="360" w:lineRule="auto" w:after="40"/>
-      </w:pPr>
-      <w:r>
-        <w:rPr>
-          <w:rFonts w:ascii="Times New Roman" w:hAnsi="Times New Roman" w:eastAsia="Times New Roman"/>
-          <w:b/>
-          <w:sz w:val="24"/>
-        </w:rPr>
-        <w:t>Conceptualization</w:t>
-      </w:r>
-      <w:r>
-        <w:rPr>
-          <w:rFonts w:ascii="Times New Roman" w:hAnsi="Times New Roman" w:eastAsia="Times New Roman"/>
-          <w:sz w:val="24"/>
-        </w:rPr>
-        <w:t>: [Author(s) to complete]</w:t>
-      </w:r>
-    </w:p>
-    <w:p>
-      <w:pPr>
-        <w:pStyle w:val="ListBullet"/>
-        <w:spacing w:line="360" w:lineRule="auto" w:after="40"/>
-      </w:pPr>
-      <w:r>
-        <w:rPr>
-          <w:rFonts w:ascii="Times New Roman" w:hAnsi="Times New Roman" w:eastAsia="Times New Roman"/>
-          <w:b/>
-          <w:sz w:val="24"/>
-        </w:rPr>
-        <w:t>Methodology</w:t>
-      </w:r>
-      <w:r>
-        <w:rPr>
-          <w:rFonts w:ascii="Times New Roman" w:hAnsi="Times New Roman" w:eastAsia="Times New Roman"/>
-          <w:sz w:val="24"/>
-        </w:rPr>
-        <w:t>: [Author(s) to complete]</w:t>
-      </w:r>
-    </w:p>
-    <w:p>
-      <w:pPr>
-        <w:pStyle w:val="ListBullet"/>
-        <w:spacing w:line="360" w:lineRule="auto" w:after="40"/>
-      </w:pPr>
-      <w:r>
-        <w:rPr>
-          <w:rFonts w:ascii="Times New Roman" w:hAnsi="Times New Roman" w:eastAsia="Times New Roman"/>
-          <w:b/>
-          <w:sz w:val="24"/>
-        </w:rPr>
-        <w:t>Formal analysis</w:t>
-      </w:r>
-      <w:r>
-        <w:rPr>
-          <w:rFonts w:ascii="Times New Roman" w:hAnsi="Times New Roman" w:eastAsia="Times New Roman"/>
-          <w:sz w:val="24"/>
-        </w:rPr>
-        <w:t>: [Author(s) to complete]</w:t>
-      </w:r>
-    </w:p>
-    <w:p>
-      <w:pPr>
-        <w:pStyle w:val="ListBullet"/>
-        <w:spacing w:line="360" w:lineRule="auto" w:after="40"/>
-      </w:pPr>
-      <w:r>
-        <w:rPr>
-          <w:rFonts w:ascii="Times New Roman" w:hAnsi="Times New Roman" w:eastAsia="Times New Roman"/>
-          <w:b/>
-          <w:sz w:val="24"/>
-        </w:rPr>
-        <w:t>Investigation</w:t>
-      </w:r>
-      <w:r>
-        <w:rPr>
-          <w:rFonts w:ascii="Times New Roman" w:hAnsi="Times New Roman" w:eastAsia="Times New Roman"/>
-          <w:sz w:val="24"/>
-        </w:rPr>
-        <w:t>: [Author(s) to complete]</w:t>
-      </w:r>
-    </w:p>
-    <w:p>
-      <w:pPr>
-        <w:pStyle w:val="ListBullet"/>
-        <w:spacing w:line="360" w:lineRule="auto" w:after="40"/>
-      </w:pPr>
-      <w:r>
-        <w:rPr>
-          <w:rFonts w:ascii="Times New Roman" w:hAnsi="Times New Roman" w:eastAsia="Times New Roman"/>
-          <w:b/>
-          <w:sz w:val="24"/>
-        </w:rPr>
-        <w:t>Data curation</w:t>
-      </w:r>
-      <w:r>
-        <w:rPr>
-          <w:rFonts w:ascii="Times New Roman" w:hAnsi="Times New Roman" w:eastAsia="Times New Roman"/>
-          <w:sz w:val="24"/>
-        </w:rPr>
-        <w:t>: [Author(s) to complete]</w:t>
-      </w:r>
-    </w:p>
-    <w:p>
-      <w:pPr>
-        <w:pStyle w:val="ListBullet"/>
-        <w:spacing w:line="360" w:lineRule="auto" w:after="40"/>
-      </w:pPr>
-      <w:r>
-        <w:rPr>
-          <w:rFonts w:ascii="Times New Roman" w:hAnsi="Times New Roman" w:eastAsia="Times New Roman"/>
-          <w:b/>
-          <w:sz w:val="24"/>
-        </w:rPr>
-        <w:t>Writing – original draft</w:t>
-      </w:r>
-      <w:r>
-        <w:rPr>
-          <w:rFonts w:ascii="Times New Roman" w:hAnsi="Times New Roman" w:eastAsia="Times New Roman"/>
-          <w:sz w:val="24"/>
-        </w:rPr>
-        <w:t>: [Author(s) to complete]</w:t>
-      </w:r>
-    </w:p>
-    <w:p>
-      <w:pPr>
-        <w:pStyle w:val="ListBullet"/>
-        <w:spacing w:line="360" w:lineRule="auto" w:after="40"/>
-      </w:pPr>
-      <w:r>
-        <w:rPr>
-          <w:rFonts w:ascii="Times New Roman" w:hAnsi="Times New Roman" w:eastAsia="Times New Roman"/>
-          <w:b/>
-          <w:sz w:val="24"/>
-        </w:rPr>
-        <w:t>Writing – review &amp; editing</w:t>
-      </w:r>
-      <w:r>
-        <w:rPr>
-          <w:rFonts w:ascii="Times New Roman" w:hAnsi="Times New Roman" w:eastAsia="Times New Roman"/>
-          <w:sz w:val="24"/>
-        </w:rPr>
-        <w:t>: [Author(s) to complete]</w:t>
-      </w:r>
-    </w:p>
-    <w:p>
-      <w:pPr>
-        <w:pStyle w:val="ListBullet"/>
-        <w:spacing w:line="360" w:lineRule="auto" w:after="40"/>
-      </w:pPr>
-      <w:r>
-        <w:rPr>
-          <w:rFonts w:ascii="Times New Roman" w:hAnsi="Times New Roman" w:eastAsia="Times New Roman"/>
-          <w:b/>
-          <w:sz w:val="24"/>
-        </w:rPr>
-        <w:t>Visualization</w:t>
-      </w:r>
-      <w:r>
-        <w:rPr>
-          <w:rFonts w:ascii="Times New Roman" w:hAnsi="Times New Roman" w:eastAsia="Times New Roman"/>
-          <w:sz w:val="24"/>
-        </w:rPr>
-        <w:t>: [Author(s) to complete]</w:t>
-      </w:r>
-    </w:p>
-    <w:p>
-      <w:pPr>
-        <w:pStyle w:val="ListBullet"/>
-        <w:spacing w:line="360" w:lineRule="auto" w:after="40"/>
-      </w:pPr>
-      <w:r>
-        <w:rPr>
-          <w:rFonts w:ascii="Times New Roman" w:hAnsi="Times New Roman" w:eastAsia="Times New Roman"/>
-          <w:b/>
-          <w:sz w:val="24"/>
-        </w:rPr>
-        <w:t>Supervision</w:t>
-      </w:r>
-      <w:r>
-        <w:rPr>
-          <w:rFonts w:ascii="Times New Roman" w:hAnsi="Times New Roman" w:eastAsia="Times New Roman"/>
-          <w:sz w:val="24"/>
-        </w:rPr>
-        <w:t>: [Author(s) to complete]</w:t>
+          <w:sz w:val="24"/>
+        </w:rPr>
+        <w:t>The variety-approval text corpus underlying this study was compiled from publicly available Ministry of Agriculture and Rural Affairs announcements via a third-party aggregation (see Methods). Parsing scripts, the field dictionary, and the list of approval-record identifiers used in the analysis are available at [repository link]. Due to the unresolved licensing status of the upstream aggregation, the full parsed dataset is not redistributed; researchers can reconstruct it from the cited public announcements using the provided scripts.</w:t>
       </w:r>
     </w:p>
     <w:p>
@@ -4306,7 +4288,7 @@
           <w:b/>
           <w:sz w:val="24"/>
         </w:rPr>
-        <w:t>Ethical approval</w:t>
+        <w:t>CRediT author contributions</w:t>
       </w:r>
     </w:p>
     <w:p>
@@ -4317,9 +4299,199 @@
       <w:r>
         <w:rPr>
           <w:rFonts w:ascii="Times New Roman" w:hAnsi="Times New Roman" w:eastAsia="Times New Roman"/>
-          <w:sz w:val="24"/>
-        </w:rPr>
-        <w:t>Not applicable. This study did not involve human participants or animal experiments; it uses only publicly available government variety-approval announcements.</w:t>
+          <w:i/>
+          <w:sz w:val="24"/>
+        </w:rPr>
+        <w:t>(Placeholder — to be completed by the author team before submission. List each named author against the CRediT roles that apply; a role may be shared by more than one author.)</w:t>
+      </w:r>
+    </w:p>
+    <w:p>
+      <w:pPr>
+        <w:pStyle w:val="ListBullet"/>
+        <w:spacing w:line="360" w:lineRule="auto" w:after="40"/>
+      </w:pPr>
+      <w:r>
+        <w:rPr>
+          <w:rFonts w:ascii="Times New Roman" w:hAnsi="Times New Roman" w:eastAsia="Times New Roman"/>
+          <w:b/>
+          <w:sz w:val="24"/>
+        </w:rPr>
+        <w:t>Conceptualization</w:t>
+      </w:r>
+      <w:r>
+        <w:rPr>
+          <w:rFonts w:ascii="Times New Roman" w:hAnsi="Times New Roman" w:eastAsia="Times New Roman"/>
+          <w:sz w:val="24"/>
+        </w:rPr>
+        <w:t>: [Author(s) to complete]</w:t>
+      </w:r>
+    </w:p>
+    <w:p>
+      <w:pPr>
+        <w:pStyle w:val="ListBullet"/>
+        <w:spacing w:line="360" w:lineRule="auto" w:after="40"/>
+      </w:pPr>
+      <w:r>
+        <w:rPr>
+          <w:rFonts w:ascii="Times New Roman" w:hAnsi="Times New Roman" w:eastAsia="Times New Roman"/>
+          <w:b/>
+          <w:sz w:val="24"/>
+        </w:rPr>
+        <w:t>Methodology</w:t>
+      </w:r>
+      <w:r>
+        <w:rPr>
+          <w:rFonts w:ascii="Times New Roman" w:hAnsi="Times New Roman" w:eastAsia="Times New Roman"/>
+          <w:sz w:val="24"/>
+        </w:rPr>
+        <w:t>: [Author(s) to complete]</w:t>
+      </w:r>
+    </w:p>
+    <w:p>
+      <w:pPr>
+        <w:pStyle w:val="ListBullet"/>
+        <w:spacing w:line="360" w:lineRule="auto" w:after="40"/>
+      </w:pPr>
+      <w:r>
+        <w:rPr>
+          <w:rFonts w:ascii="Times New Roman" w:hAnsi="Times New Roman" w:eastAsia="Times New Roman"/>
+          <w:b/>
+          <w:sz w:val="24"/>
+        </w:rPr>
+        <w:t>Formal analysis</w:t>
+      </w:r>
+      <w:r>
+        <w:rPr>
+          <w:rFonts w:ascii="Times New Roman" w:hAnsi="Times New Roman" w:eastAsia="Times New Roman"/>
+          <w:sz w:val="24"/>
+        </w:rPr>
+        <w:t>: [Author(s) to complete]</w:t>
+      </w:r>
+    </w:p>
+    <w:p>
+      <w:pPr>
+        <w:pStyle w:val="ListBullet"/>
+        <w:spacing w:line="360" w:lineRule="auto" w:after="40"/>
+      </w:pPr>
+      <w:r>
+        <w:rPr>
+          <w:rFonts w:ascii="Times New Roman" w:hAnsi="Times New Roman" w:eastAsia="Times New Roman"/>
+          <w:b/>
+          <w:sz w:val="24"/>
+        </w:rPr>
+        <w:t>Investigation</w:t>
+      </w:r>
+      <w:r>
+        <w:rPr>
+          <w:rFonts w:ascii="Times New Roman" w:hAnsi="Times New Roman" w:eastAsia="Times New Roman"/>
+          <w:sz w:val="24"/>
+        </w:rPr>
+        <w:t>: [Author(s) to complete]</w:t>
+      </w:r>
+    </w:p>
+    <w:p>
+      <w:pPr>
+        <w:pStyle w:val="ListBullet"/>
+        <w:spacing w:line="360" w:lineRule="auto" w:after="40"/>
+      </w:pPr>
+      <w:r>
+        <w:rPr>
+          <w:rFonts w:ascii="Times New Roman" w:hAnsi="Times New Roman" w:eastAsia="Times New Roman"/>
+          <w:b/>
+          <w:sz w:val="24"/>
+        </w:rPr>
+        <w:t>Data curation</w:t>
+      </w:r>
+      <w:r>
+        <w:rPr>
+          <w:rFonts w:ascii="Times New Roman" w:hAnsi="Times New Roman" w:eastAsia="Times New Roman"/>
+          <w:sz w:val="24"/>
+        </w:rPr>
+        <w:t>: [Author(s) to complete]</w:t>
+      </w:r>
+    </w:p>
+    <w:p>
+      <w:pPr>
+        <w:pStyle w:val="ListBullet"/>
+        <w:spacing w:line="360" w:lineRule="auto" w:after="40"/>
+      </w:pPr>
+      <w:r>
+        <w:rPr>
+          <w:rFonts w:ascii="Times New Roman" w:hAnsi="Times New Roman" w:eastAsia="Times New Roman"/>
+          <w:b/>
+          <w:sz w:val="24"/>
+        </w:rPr>
+        <w:t>Writing – original draft</w:t>
+      </w:r>
+      <w:r>
+        <w:rPr>
+          <w:rFonts w:ascii="Times New Roman" w:hAnsi="Times New Roman" w:eastAsia="Times New Roman"/>
+          <w:sz w:val="24"/>
+        </w:rPr>
+        <w:t>: [Author(s) to complete]</w:t>
+      </w:r>
+    </w:p>
+    <w:p>
+      <w:pPr>
+        <w:pStyle w:val="ListBullet"/>
+        <w:spacing w:line="360" w:lineRule="auto" w:after="40"/>
+      </w:pPr>
+      <w:r>
+        <w:rPr>
+          <w:rFonts w:ascii="Times New Roman" w:hAnsi="Times New Roman" w:eastAsia="Times New Roman"/>
+          <w:b/>
+          <w:sz w:val="24"/>
+        </w:rPr>
+        <w:t>Writing – review &amp; editing</w:t>
+      </w:r>
+      <w:r>
+        <w:rPr>
+          <w:rFonts w:ascii="Times New Roman" w:hAnsi="Times New Roman" w:eastAsia="Times New Roman"/>
+          <w:sz w:val="24"/>
+        </w:rPr>
+        <w:t>: [Author(s) to complete]</w:t>
+      </w:r>
+    </w:p>
+    <w:p>
+      <w:pPr>
+        <w:pStyle w:val="ListBullet"/>
+        <w:spacing w:line="360" w:lineRule="auto" w:after="40"/>
+      </w:pPr>
+      <w:r>
+        <w:rPr>
+          <w:rFonts w:ascii="Times New Roman" w:hAnsi="Times New Roman" w:eastAsia="Times New Roman"/>
+          <w:b/>
+          <w:sz w:val="24"/>
+        </w:rPr>
+        <w:t>Visualization</w:t>
+      </w:r>
+      <w:r>
+        <w:rPr>
+          <w:rFonts w:ascii="Times New Roman" w:hAnsi="Times New Roman" w:eastAsia="Times New Roman"/>
+          <w:sz w:val="24"/>
+        </w:rPr>
+        <w:t>: [Author(s) to complete]</w:t>
+      </w:r>
+    </w:p>
+    <w:p>
+      <w:pPr>
+        <w:pStyle w:val="ListBullet"/>
+        <w:spacing w:line="360" w:lineRule="auto" w:after="40"/>
+      </w:pPr>
+      <w:r>
+        <w:rPr>
+          <w:rFonts w:ascii="Times New Roman" w:hAnsi="Times New Roman" w:eastAsia="Times New Roman"/>
+          <w:b/>
+          <w:sz w:val="24"/>
+        </w:rPr>
+        <w:t>Supervision</w:t>
+      </w:r>
+      <w:r>
+        <w:rPr>
+          <w:rFonts w:ascii="Times New Roman" w:hAnsi="Times New Roman" w:eastAsia="Times New Roman"/>
+          <w:sz w:val="24"/>
+        </w:rPr>
+        <w:t>: [Author(s) to complete]</w:t>
       </w:r>
     </w:p>
     <w:p>
@@ -4332,9 +4504,9 @@
         <w:rPr>
           <w:rFonts w:ascii="Times New Roman" w:hAnsi="Times New Roman" w:eastAsia="Times New Roman"/>
           <w:b/>
-          <w:sz w:val="26"/>
-        </w:rPr>
-        <w:t>References</w:t>
+          <w:sz w:val="24"/>
+        </w:rPr>
+        <w:t>Ethical approval</w:t>
       </w:r>
     </w:p>
     <w:p>
@@ -4347,11 +4519,26 @@
           <w:rFonts w:ascii="Times New Roman" w:hAnsi="Times New Roman" w:eastAsia="Times New Roman"/>
           <w:sz w:val="24"/>
         </w:rPr>
-        <w:t>Bar T, Zheng Y. 2019. Choosing certifiers: Evidence from the British Retail Consortium food safety standard. American Journal of Agricultural Economics, 101, 74–88.</w:t>
+        <w:t>Not applicable. This study did not involve human participants or animal experiments; it uses only publicly available government variety-approval announcements.</w:t>
       </w:r>
     </w:p>
     <w:p>
       <w:pPr>
+        <w:keepNext/>
+        <w:spacing w:line="480" w:lineRule="auto" w:after="120"/>
+        <w:jc w:val="left"/>
+      </w:pPr>
+      <w:r>
+        <w:rPr>
+          <w:rFonts w:ascii="Times New Roman" w:hAnsi="Times New Roman" w:eastAsia="Times New Roman"/>
+          <w:b/>
+          <w:sz w:val="26"/>
+        </w:rPr>
+        <w:t>References</w:t>
+      </w:r>
+    </w:p>
+    <w:p>
+      <w:pPr>
         <w:spacing w:line="480" w:lineRule="auto" w:after="160"/>
         <w:jc w:val="left"/>
       </w:pPr>
@@ -4360,7 +4547,7 @@
           <w:rFonts w:ascii="Times New Roman" w:hAnsi="Times New Roman" w:eastAsia="Times New Roman"/>
           <w:sz w:val="24"/>
         </w:rPr>
-        <w:t>Duflo E, Greenstone M, Pande R, Ryan N. 2013. Truth-telling by third-party auditors and the response of polluting firms: Experimental evidence from India. Quarterly Journal of Economics, 128, 1499–1545.</w:t>
+        <w:t>Antons D, Grünwald E, Cichy P, Salge T O. 2020. The application of text mining methods in innovation research: Current state, evolution patterns, and development priorities. R&amp;D Management, 50, 329–351.</w:t>
       </w:r>
     </w:p>
     <w:p>
@@ -4373,7 +4560,7 @@
           <w:rFonts w:ascii="Times New Roman" w:hAnsi="Times New Roman" w:eastAsia="Times New Roman"/>
           <w:sz w:val="24"/>
         </w:rPr>
-        <w:t>Gong J, Zhang X, Zhang J, Zeng B, Zhang X, Xu X, Xie H A. 2026. Three-line hybrid rice in China: sustained improvements in yield, quality, and resistance over fifty years. Rice Science. (title-level citation only; full text not accessible at time of writing, no specific figures attributed)</w:t>
+        <w:t>Bar T, Zheng Y. 2019. Choosing certifiers: Evidence from the British Retail Consortium food safety standard. American Journal of Agricultural Economics, 101, 74–88.</w:t>
       </w:r>
     </w:p>
     <w:p>
@@ -4386,7 +4573,7 @@
           <w:rFonts w:ascii="Times New Roman" w:hAnsi="Times New Roman" w:eastAsia="Times New Roman"/>
           <w:sz w:val="24"/>
         </w:rPr>
-        <w:t>Grennan M, Town R J. 2020. Regulating innovation with uncertain quality: Information, risk, and access in medical devices. American Economic Review, 110, 120–161.</w:t>
+        <w:t>Duflo E, Greenstone M, Pande R, Ryan N. 2013. Truth-telling by third-party auditors and the response of polluting firms: Experimental evidence from India. Quarterly Journal of Economics, 128, 1499–1545.</w:t>
       </w:r>
     </w:p>
     <w:p>
@@ -4399,7 +4586,7 @@
           <w:rFonts w:ascii="Times New Roman" w:hAnsi="Times New Roman" w:eastAsia="Times New Roman"/>
           <w:sz w:val="24"/>
         </w:rPr>
-        <w:t>Hang S, Wang Q, Wang Y, Xiang H. 2024. Evolution of rice cultivar performance across China: A multi-dimensional study on yield and agronomic characteristics over three decades. Agronomy, 14, 2780.</w:t>
+        <w:t>Franceschini F, Maisano D, Mastrogiacomo L. 2016. Empirical analysis and classification of database errors in Scopus and Web of Science. Journal of Informetrics, 10, 933–953.</w:t>
       </w:r>
     </w:p>
     <w:p>
@@ -4412,7 +4599,7 @@
           <w:rFonts w:ascii="Times New Roman" w:hAnsi="Times New Roman" w:eastAsia="Times New Roman"/>
           <w:sz w:val="24"/>
         </w:rPr>
-        <w:t>Huang Z Y, Xu Y, Zeng D, Wang C, Wang J M. 2018. One size fits all? Contract farming among broiler producers in China. Journal of Integrative Agriculture, 17, 473–482.</w:t>
+        <w:t>Gong J, Zhang X, Zhang J, Zeng B, Zhang X, Xu X, Xie H A. 2026. Three-line hybrid rice in China: sustained improvements in yield, quality, and resistance over fifty years. Rice Science. (title-level citation only; full text not accessible at time of writing, no specific figures attributed)</w:t>
       </w:r>
     </w:p>
     <w:p>
@@ -4425,7 +4612,7 @@
           <w:rFonts w:ascii="Times New Roman" w:hAnsi="Times New Roman" w:eastAsia="Times New Roman"/>
           <w:sz w:val="24"/>
         </w:rPr>
-        <w:t>Laidig F, Piepho H-P, Drobek T, Meyer U. 2014. Genetic and non-genetic long-term trends of 12 different crops in German official variety performance trials and on-farm yield trends. Theoretical and Applied Genetics, 127, 2599–2617.</w:t>
+        <w:t>Grennan M, Town R J. 2020. Regulating innovation with uncertain quality: Information, risk, and access in medical devices. American Economic Review, 110, 120–161.</w:t>
       </w:r>
     </w:p>
     <w:p>
@@ -4438,7 +4625,7 @@
           <w:rFonts w:ascii="Times New Roman" w:hAnsi="Times New Roman" w:eastAsia="Times New Roman"/>
           <w:sz w:val="24"/>
         </w:rPr>
-        <w:t>Lu Y, Tang Y, Zhang J, Liu S, Liang X, Li M, Li R. 2024. Variations and trends in rice quality across different types of approved varieties in China, 1978–2022. Agronomy, 14, 1234.</w:t>
+        <w:t>Hang S, Wang Q, Wang Y, Xiang H. 2024. Evolution of rice cultivar performance across China: A multi-dimensional study on yield and agronomic characteristics over three decades. Agronomy, 14, 2780.</w:t>
       </w:r>
     </w:p>
     <w:p>
@@ -4451,7 +4638,7 @@
           <w:rFonts w:ascii="Times New Roman" w:hAnsi="Times New Roman" w:eastAsia="Times New Roman"/>
           <w:sz w:val="24"/>
         </w:rPr>
-        <w:t>Mackay I, Horwell A, Garner J, White J, McKee J, Philpott H. 2011. Reanalyses of the historical series of UK variety trials to quantify the contributions of genetic and environmental factors to trends and variability in yield over time. Theoretical and Applied Genetics, 122, 225–238.</w:t>
+        <w:t>Huang Z Y, Xu Y, Zeng D, Wang C, Wang J M. 2018. One size fits all? Contract farming among broiler producers in China. Journal of Integrative Agriculture, 17, 473–482.</w:t>
       </w:r>
     </w:p>
     <w:p>
@@ -4464,7 +4651,7 @@
           <w:rFonts w:ascii="Times New Roman" w:hAnsi="Times New Roman" w:eastAsia="Times New Roman"/>
           <w:sz w:val="24"/>
         </w:rPr>
-        <w:t>Piepho H-P, Laidig F. 2024. How many checks are needed per cycle in a plant breeding or variety testing programme? Plant Breeding.</w:t>
+        <w:t>Jaffe A B, de Rassenfosse G. 2017. Patent citation data in social science research: Overview and best practices. Journal of the Association for Information Science and Technology, 68, 1360–1374.</w:t>
       </w:r>
     </w:p>
     <w:p>
@@ -4477,7 +4664,7 @@
           <w:rFonts w:ascii="Times New Roman" w:hAnsi="Times New Roman" w:eastAsia="Times New Roman"/>
           <w:sz w:val="24"/>
         </w:rPr>
-        <w:t>Piepho H-P, Laidig F, Drobek T, Meyer U. 2014. Dissecting genetic and non-genetic sources of long-term yield trend in German official variety trials. Theoretical and Applied Genetics, 127, 1009–1018.</w:t>
+        <w:t>Laidig F, Piepho H-P, Drobek T, Meyer U. 2014. Genetic and non-genetic long-term trends of 12 different crops in German official variety performance trials and on-farm yield trends. Theoretical and Applied Genetics, 127, 2599–2617.</w:t>
       </w:r>
     </w:p>
     <w:p>
@@ -4490,7 +4677,7 @@
           <w:rFonts w:ascii="Times New Roman" w:hAnsi="Times New Roman" w:eastAsia="Times New Roman"/>
           <w:sz w:val="24"/>
         </w:rPr>
-        <w:t>Qiu H G, Wang X B, Zhang C P, Xu Z G. 2016. Farmers' seed choice behaviors under asymmetrical information: Evidence from maize farming in China. Journal of Integrative Agriculture, 15, 1915–1923.</w:t>
+        <w:t>Losiewicz P, Oard D W, Kostoff R N. 2000. Textual data mining to support science and technology management. Journal of Intelligent Information Systems, 15, 99–119.</w:t>
       </w:r>
     </w:p>
     <w:p>
@@ -4503,7 +4690,7 @@
           <w:rFonts w:ascii="Times New Roman" w:hAnsi="Times New Roman" w:eastAsia="Times New Roman"/>
           <w:sz w:val="24"/>
         </w:rPr>
-        <w:t>Raymond J, Mackay I, Penfield S, Lovett A, Philpott H, Dorling S. 2023. Continuing genetic improvement and biases in genetic gain estimates revealed in historical UK variety trials data. Field Crops Research, 303, 109086.</w:t>
+        <w:t>Lu Y, Tang Y, Zhang J, Liu S, Liang X, Li M, Li R. 2024. Variations and trends in rice quality across different types of approved varieties in China, 1978–2022. Agronomy, 14, 1234.</w:t>
       </w:r>
     </w:p>
     <w:p>
@@ -4516,7 +4703,7 @@
           <w:rFonts w:ascii="Times New Roman" w:hAnsi="Times New Roman" w:eastAsia="Times New Roman"/>
           <w:sz w:val="24"/>
         </w:rPr>
-        <w:t>Renckens S, Auld G. 2022. Time to certify: Explaining varying efficiency of private regulatory audits. Regulation &amp; Governance, 16, 500–518.</w:t>
+        <w:t>Mackay I, Horwell A, Garner J, White J, McKee J, Philpott H. 2011. Reanalyses of the historical series of UK variety trials to quantify the contributions of genetic and environmental factors to trends and variability in yield over time. Theoretical and Applied Genetics, 122, 225–238.</w:t>
       </w:r>
     </w:p>
     <w:p>
@@ -4529,7 +4716,98 @@
           <w:rFonts w:ascii="Times New Roman" w:hAnsi="Times New Roman" w:eastAsia="Times New Roman"/>
           <w:sz w:val="24"/>
         </w:rPr>
+        <w:t>Piepho H-P, Laidig F. 2024. How many checks are needed per cycle in a plant breeding or variety testing programme? Plant Breeding.</w:t>
+      </w:r>
+    </w:p>
+    <w:p>
+      <w:pPr>
+        <w:spacing w:line="480" w:lineRule="auto" w:after="160"/>
+        <w:jc w:val="left"/>
+      </w:pPr>
+      <w:r>
+        <w:rPr>
+          <w:rFonts w:ascii="Times New Roman" w:hAnsi="Times New Roman" w:eastAsia="Times New Roman"/>
+          <w:sz w:val="24"/>
+        </w:rPr>
+        <w:t>Piepho H-P, Laidig F, Drobek T, Meyer U. 2014. Dissecting genetic and non-genetic sources of long-term yield trend in German official variety trials. Theoretical and Applied Genetics, 127, 1009–1018.</w:t>
+      </w:r>
+    </w:p>
+    <w:p>
+      <w:pPr>
+        <w:spacing w:line="480" w:lineRule="auto" w:after="160"/>
+        <w:jc w:val="left"/>
+      </w:pPr>
+      <w:r>
+        <w:rPr>
+          <w:rFonts w:ascii="Times New Roman" w:hAnsi="Times New Roman" w:eastAsia="Times New Roman"/>
+          <w:sz w:val="24"/>
+        </w:rPr>
+        <w:t>Qiu H G, Wang X B, Zhang C P, Xu Z G. 2016. Farmers' seed choice behaviors under asymmetrical information: Evidence from maize farming in China. Journal of Integrative Agriculture, 15, 1915–1923.</w:t>
+      </w:r>
+    </w:p>
+    <w:p>
+      <w:pPr>
+        <w:spacing w:line="480" w:lineRule="auto" w:after="160"/>
+        <w:jc w:val="left"/>
+      </w:pPr>
+      <w:r>
+        <w:rPr>
+          <w:rFonts w:ascii="Times New Roman" w:hAnsi="Times New Roman" w:eastAsia="Times New Roman"/>
+          <w:sz w:val="24"/>
+        </w:rPr>
+        <w:t>Rammer C, Es-Sadki N. 2023. Using big data for generating firm-level innovation indicators — A literature review. Technological Forecasting and Social Change, 197, 122874.</w:t>
+      </w:r>
+    </w:p>
+    <w:p>
+      <w:pPr>
+        <w:spacing w:line="480" w:lineRule="auto" w:after="160"/>
+        <w:jc w:val="left"/>
+      </w:pPr>
+      <w:r>
+        <w:rPr>
+          <w:rFonts w:ascii="Times New Roman" w:hAnsi="Times New Roman" w:eastAsia="Times New Roman"/>
+          <w:sz w:val="24"/>
+        </w:rPr>
+        <w:t>Raymond J, Mackay I, Penfield S, Lovett A, Philpott H, Dorling S. 2023. Continuing genetic improvement and biases in genetic gain estimates revealed in historical UK variety trials data. Field Crops Research, 303, 109086.</w:t>
+      </w:r>
+    </w:p>
+    <w:p>
+      <w:pPr>
+        <w:spacing w:line="480" w:lineRule="auto" w:after="160"/>
+        <w:jc w:val="left"/>
+      </w:pPr>
+      <w:r>
+        <w:rPr>
+          <w:rFonts w:ascii="Times New Roman" w:hAnsi="Times New Roman" w:eastAsia="Times New Roman"/>
+          <w:sz w:val="24"/>
+        </w:rPr>
+        <w:t>Renckens S, Auld G. 2022. Time to certify: Explaining varying efficiency of private regulatory audits. Regulation &amp; Governance, 16, 500–518.</w:t>
+      </w:r>
+    </w:p>
+    <w:p>
+      <w:pPr>
+        <w:spacing w:line="480" w:lineRule="auto" w:after="160"/>
+        <w:jc w:val="left"/>
+      </w:pPr>
+      <w:r>
+        <w:rPr>
+          <w:rFonts w:ascii="Times New Roman" w:hAnsi="Times New Roman" w:eastAsia="Times New Roman"/>
+          <w:sz w:val="24"/>
+        </w:rPr>
         <w:t>Shi X, Hu R. 2017. Rice variety improvement and the contribution of foreign germplasms in China. Journal of Integrative Agriculture, 16, 2337–2345.</w:t>
+      </w:r>
+    </w:p>
+    <w:p>
+      <w:pPr>
+        <w:spacing w:line="480" w:lineRule="auto" w:after="160"/>
+        <w:jc w:val="left"/>
+      </w:pPr>
+      <w:r>
+        <w:rPr>
+          <w:rFonts w:ascii="Times New Roman" w:hAnsi="Times New Roman" w:eastAsia="Times New Roman"/>
+          <w:sz w:val="24"/>
+        </w:rPr>
+        <w:t>Shi Y, Ren P, Zhang Y, Gong X, Hu M, Liang H. 2021. Information extraction from FDA drug labeling to enhance product-specific guidance assessment using natural language processing. Frontiers in Research Metrics and Analytics, 6, 670006.</w:t>
       </w:r>
     </w:p>
     <w:p>

</xml_diff>